<commit_message>
Remove friend resume and referee details
</commit_message>
<xml_diff>
--- a/murray-lewin/Murray Lewin Resume - Fortescue (AU).docx
+++ b/murray-lewin/Murray Lewin Resume - Fortescue (AU).docx
@@ -1,519 +1,27 @@
 
-<file path=customXml\item1.xml><?xml version="1.0" encoding="utf-8"?>
-<p:properties xmlns:p="http://schemas.microsoft.com/office/2006/metadata/properties" xmlns:xsi="http://www.w3.org/2001/XMLSchema-instance" xmlns:pc="http://schemas.microsoft.com/office/infopath/2007/PartnerControls">
-  <documentManagement>
-    <_ip_UnifiedCompliancePolicyUIAction xmlns="http://schemas.microsoft.com/sharepoint/v3" xsi:nil="true"/>
-    <_ip_UnifiedCompliancePolicyProperties xmlns="http://schemas.microsoft.com/sharepoint/v3" xsi:nil="true"/>
-    <TaxCatchAll xmlns="230e9df3-be65-4c73-a93b-d1236ebd677e" xsi:nil="true"/>
-    <ImageTagsTaxHTField xmlns="71af3243-3dd4-4a8d-8c0d-dd76da1f02a5">
-      <Terms xmlns="http://schemas.microsoft.com/office/infopath/2007/PartnerControls"/>
-    </ImageTagsTaxHTField>
-    <Image xmlns="71af3243-3dd4-4a8d-8c0d-dd76da1f02a5">
-      <Url xsi:nil="true"/>
-      <Description xsi:nil="true"/>
-    </Image>
-    <Status xmlns="71af3243-3dd4-4a8d-8c0d-dd76da1f02a5">Not started</Status>
-    <Background xmlns="71af3243-3dd4-4a8d-8c0d-dd76da1f02a5">false</Background>
-    <MediaServiceKeyPoints xmlns="71af3243-3dd4-4a8d-8c0d-dd76da1f02a5" xsi:nil="true"/>
-    <SharedWithUsers xmlns="16c05727-aa75-4e4a-9b5f-8a80a1165891">
-      <UserInfo>
-        <DisplayName/>
-        <AccountId xsi:nil="true"/>
-        <AccountType/>
-      </UserInfo>
-    </SharedWithUsers>
-  </documentManagement>
-</p:properties>
-</file>
-
-<file path=customXml\item2.xml><?xml version="1.0" encoding="utf-8"?>
-<b:Sources xmlns:b="http://schemas.openxmlformats.org/officeDocument/2006/bibliography" xmlns="http://schemas.openxmlformats.org/officeDocument/2006/bibliography" SelectedStyle="\APASixthEditionOfficeOnline.xsl" StyleName="APA" Version="6"/>
-</file>
-
-<file path=customXml\item3.xml><?xml version="1.0" encoding="utf-8"?>
-<ct:contentTypeSchema xmlns:ct="http://schemas.microsoft.com/office/2006/metadata/contentType" xmlns:ma="http://schemas.microsoft.com/office/2006/metadata/properties/metaAttributes" ct:_="" ma:_="" ma:contentTypeName="Document" ma:contentTypeID="0x01010079F111ED35F8CC479449609E8A0923A6" ma:contentTypeVersion="30" ma:contentTypeDescription="Create a new document." ma:contentTypeScope="" ma:versionID="cec0622158e8f13124e9e8fd4de31bd1">
-  <xsd:schema xmlns:xsd="http://www.w3.org/2001/XMLSchema" xmlns:xs="http://www.w3.org/2001/XMLSchema" xmlns:p="http://schemas.microsoft.com/office/2006/metadata/properties" xmlns:ns1="http://schemas.microsoft.com/sharepoint/v3" xmlns:ns2="71af3243-3dd4-4a8d-8c0d-dd76da1f02a5" xmlns:ns3="16c05727-aa75-4e4a-9b5f-8a80a1165891" xmlns:ns4="230e9df3-be65-4c73-a93b-d1236ebd677e" targetNamespace="http://schemas.microsoft.com/office/2006/metadata/properties" ma:root="true" ma:fieldsID="3b52f30ab005d15df08657af532e6e38" ns1:_="" ns2:_="" ns3:_="" ns4:_="">
-    <xsd:import namespace="http://schemas.microsoft.com/sharepoint/v3"/>
-    <xsd:import namespace="71af3243-3dd4-4a8d-8c0d-dd76da1f02a5"/>
-    <xsd:import namespace="16c05727-aa75-4e4a-9b5f-8a80a1165891"/>
-    <xsd:import namespace="230e9df3-be65-4c73-a93b-d1236ebd677e"/>
-    <xsd:element name="properties">
-      <xsd:complexType>
-        <xsd:sequence>
-          <xsd:element name="documentManagement">
-            <xsd:complexType>
-              <xsd:all>
-                <xsd:element ref="ns2:Status" minOccurs="0"/>
-                <xsd:element ref="ns2:Image" minOccurs="0"/>
-                <xsd:element ref="ns2:MediaServiceMetadata" minOccurs="0"/>
-                <xsd:element ref="ns2:MediaServiceFastMetadata" minOccurs="0"/>
-                <xsd:element ref="ns2:MediaServiceOCR" minOccurs="0"/>
-                <xsd:element ref="ns2:MediaServiceAutoTags" minOccurs="0"/>
-                <xsd:element ref="ns2:MediaServiceEventHashCode" minOccurs="0"/>
-                <xsd:element ref="ns2:MediaServiceGenerationTime" minOccurs="0"/>
-                <xsd:element ref="ns3:SharedWithUsers" minOccurs="0"/>
-                <xsd:element ref="ns3:SharedWithDetails" minOccurs="0"/>
-                <xsd:element ref="ns2:MediaServiceAutoKeyPoints" minOccurs="0"/>
-                <xsd:element ref="ns2:MediaServiceKeyPoints" minOccurs="0"/>
-                <xsd:element ref="ns2:MediaServiceDateTaken" minOccurs="0"/>
-                <xsd:element ref="ns1:_ip_UnifiedCompliancePolicyProperties" minOccurs="0"/>
-                <xsd:element ref="ns1:_ip_UnifiedCompliancePolicyUIAction" minOccurs="0"/>
-                <xsd:element ref="ns4:TaxCatchAll" minOccurs="0"/>
-                <xsd:element ref="ns2:ImageTagsTaxHTField" minOccurs="0"/>
-                <xsd:element ref="ns2:MediaServiceLocation" minOccurs="0"/>
-                <xsd:element ref="ns2:MediaLengthInSeconds" minOccurs="0"/>
-                <xsd:element ref="ns2:Background" minOccurs="0"/>
-                <xsd:element ref="ns2:MediaServiceSearchProperties" minOccurs="0"/>
-                <xsd:element ref="ns2:MediaServiceDocTags" minOccurs="0"/>
-                <xsd:element ref="ns2:MediaServiceObjectDetectorVersions" minOccurs="0"/>
-                <xsd:element ref="ns2:MediaServiceSystemTags" minOccurs="0"/>
-                <xsd:element ref="ns2:MediaServiceBillingMetadata" minOccurs="0"/>
-              </xsd:all>
-            </xsd:complexType>
-          </xsd:element>
-        </xsd:sequence>
-      </xsd:complexType>
-    </xsd:element>
-  </xsd:schema>
-  <xsd:schema xmlns:xsd="http://www.w3.org/2001/XMLSchema" xmlns:xs="http://www.w3.org/2001/XMLSchema" xmlns:dms="http://schemas.microsoft.com/office/2006/documentManagement/types" xmlns:pc="http://schemas.microsoft.com/office/infopath/2007/PartnerControls" targetNamespace="http://schemas.microsoft.com/sharepoint/v3" elementFormDefault="qualified">
-    <xsd:import namespace="http://schemas.microsoft.com/office/2006/documentManagement/types"/>
-    <xsd:import namespace="http://schemas.microsoft.com/office/infopath/2007/PartnerControls"/>
-    <xsd:element name="_ip_UnifiedCompliancePolicyProperties" ma:index="20" nillable="true" ma:displayName="Unified Compliance Policy Properties" ma:hidden="true" ma:internalName="_ip_UnifiedCompliancePolicyProperties" ma:readOnly="false">
-      <xsd:simpleType>
-        <xsd:restriction base="dms:Note"/>
-      </xsd:simpleType>
-    </xsd:element>
-    <xsd:element name="_ip_UnifiedCompliancePolicyUIAction" ma:index="21" nillable="true" ma:displayName="Unified Compliance Policy UI Action" ma:hidden="true" ma:internalName="_ip_UnifiedCompliancePolicyUIAction" ma:readOnly="false">
-      <xsd:simpleType>
-        <xsd:restriction base="dms:Text"/>
-      </xsd:simpleType>
-    </xsd:element>
-  </xsd:schema>
-  <xsd:schema xmlns:xsd="http://www.w3.org/2001/XMLSchema" xmlns:xs="http://www.w3.org/2001/XMLSchema" xmlns:dms="http://schemas.microsoft.com/office/2006/documentManagement/types" xmlns:pc="http://schemas.microsoft.com/office/infopath/2007/PartnerControls" targetNamespace="71af3243-3dd4-4a8d-8c0d-dd76da1f02a5" elementFormDefault="qualified">
-    <xsd:import namespace="http://schemas.microsoft.com/office/2006/documentManagement/types"/>
-    <xsd:import namespace="http://schemas.microsoft.com/office/infopath/2007/PartnerControls"/>
-    <xsd:element name="Status" ma:index="2" nillable="true" ma:displayName="Status" ma:default="Not started" ma:format="Dropdown" ma:hidden="true" ma:internalName="Status" ma:readOnly="false">
-      <xsd:simpleType>
-        <xsd:restriction base="dms:Choice">
-          <xsd:enumeration value="Not started"/>
-          <xsd:enumeration value="In Progress"/>
-          <xsd:enumeration value="Completed"/>
-        </xsd:restriction>
-      </xsd:simpleType>
-    </xsd:element>
-    <xsd:element name="Image" ma:index="3" nillable="true" ma:displayName="Image" ma:format="Image" ma:hidden="true" ma:internalName="Image" ma:readOnly="false">
-      <xsd:complexType>
-        <xsd:complexContent>
-          <xsd:extension base="dms:URL">
-            <xsd:sequence>
-              <xsd:element name="Url" type="dms:ValidUrl" minOccurs="0" nillable="true"/>
-              <xsd:element name="Description" type="xsd:string" nillable="true"/>
-            </xsd:sequence>
-          </xsd:extension>
-        </xsd:complexContent>
-      </xsd:complexType>
-    </xsd:element>
-    <xsd:element name="MediaServiceMetadata" ma:index="8" nillable="true" ma:displayName="MediaServiceMetadata" ma:hidden="true" ma:internalName="MediaServiceMetadata" ma:readOnly="true">
-      <xsd:simpleType>
-        <xsd:restriction base="dms:Note"/>
-      </xsd:simpleType>
-    </xsd:element>
-    <xsd:element name="MediaServiceFastMetadata" ma:index="9" nillable="true" ma:displayName="MediaServiceFastMetadata" ma:hidden="true" ma:internalName="MediaServiceFastMetadata" ma:readOnly="true">
-      <xsd:simpleType>
-        <xsd:restriction base="dms:Note"/>
-      </xsd:simpleType>
-    </xsd:element>
-    <xsd:element name="MediaServiceOCR" ma:index="10" nillable="true" ma:displayName="MediaServiceOCR" ma:hidden="true" ma:internalName="MediaServiceOCR" ma:readOnly="true">
-      <xsd:simpleType>
-        <xsd:restriction base="dms:Note"/>
-      </xsd:simpleType>
-    </xsd:element>
-    <xsd:element name="MediaServiceAutoTags" ma:index="11" nillable="true" ma:displayName="MediaServiceAutoTags" ma:hidden="true" ma:internalName="MediaServiceAutoTags" ma:readOnly="true">
-      <xsd:simpleType>
-        <xsd:restriction base="dms:Text"/>
-      </xsd:simpleType>
-    </xsd:element>
-    <xsd:element name="MediaServiceEventHashCode" ma:index="12" nillable="true" ma:displayName="MediaServiceEventHashCode" ma:hidden="true" ma:internalName="MediaServiceEventHashCode" ma:readOnly="true">
-      <xsd:simpleType>
-        <xsd:restriction base="dms:Text"/>
-      </xsd:simpleType>
-    </xsd:element>
-    <xsd:element name="MediaServiceGenerationTime" ma:index="13" nillable="true" ma:displayName="MediaServiceGenerationTime" ma:hidden="true" ma:internalName="MediaServiceGenerationTime" ma:readOnly="true">
-      <xsd:simpleType>
-        <xsd:restriction base="dms:Text"/>
-      </xsd:simpleType>
-    </xsd:element>
-    <xsd:element name="MediaServiceAutoKeyPoints" ma:index="16" nillable="true" ma:displayName="MediaServiceAutoKeyPoints" ma:hidden="true" ma:internalName="MediaServiceAutoKeyPoints" ma:readOnly="true">
-      <xsd:simpleType>
-        <xsd:restriction base="dms:Note"/>
-      </xsd:simpleType>
-    </xsd:element>
-    <xsd:element name="MediaServiceKeyPoints" ma:index="17" nillable="true" ma:displayName="KeyPoints" ma:hidden="true" ma:internalName="MediaServiceKeyPoints" ma:readOnly="false">
-      <xsd:simpleType>
-        <xsd:restriction base="dms:Note"/>
-      </xsd:simpleType>
-    </xsd:element>
-    <xsd:element name="MediaServiceDateTaken" ma:index="18" nillable="true" ma:displayName="MediaServiceDateTaken" ma:hidden="true" ma:internalName="MediaServiceDateTaken" ma:readOnly="true">
-      <xsd:simpleType>
-        <xsd:restriction base="dms:Text"/>
-      </xsd:simpleType>
-    </xsd:element>
-    <xsd:element name="ImageTagsTaxHTField" ma:index="25" nillable="true" ma:taxonomy="true" ma:internalName="ImageTagsTaxHTField" ma:taxonomyFieldName="MediaServiceImageTags" ma:displayName="Image Tags" ma:readOnly="false" ma:fieldId="{5cf76f15-5ced-4ddc-b409-7134ff3c332f}" ma:taxonomyMulti="true" ma:sspId="e385fb40-52d4-4fae-9c5b-3e8ff8a5878e" ma:termSetId="09814cd3-568e-fe90-9814-8d621ff8fb84" ma:anchorId="fba54fb3-c3e1-fe81-a776-ca4b69148c4d" ma:open="true" ma:isKeyword="false">
-      <xsd:complexType>
-        <xsd:sequence>
-          <xsd:element ref="pc:Terms" minOccurs="0" maxOccurs="1"/>
-        </xsd:sequence>
-      </xsd:complexType>
-    </xsd:element>
-    <xsd:element name="MediaServiceLocation" ma:index="26" nillable="true" ma:displayName="Location" ma:hidden="true" ma:internalName="MediaServiceLocation" ma:readOnly="true">
-      <xsd:simpleType>
-        <xsd:restriction base="dms:Text"/>
-      </xsd:simpleType>
-    </xsd:element>
-    <xsd:element name="MediaLengthInSeconds" ma:index="27" nillable="true" ma:displayName="MediaLengthInSeconds" ma:hidden="true" ma:internalName="MediaLengthInSeconds" ma:readOnly="true">
-      <xsd:simpleType>
-        <xsd:restriction base="dms:Unknown"/>
-      </xsd:simpleType>
-    </xsd:element>
-    <xsd:element name="Background" ma:index="28" nillable="true" ma:displayName="Background" ma:default="0" ma:format="Dropdown" ma:hidden="true" ma:internalName="Background" ma:readOnly="false">
-      <xsd:simpleType>
-        <xsd:restriction base="dms:Boolean"/>
-      </xsd:simpleType>
-    </xsd:element>
-    <xsd:element name="MediaServiceSearchProperties" ma:index="29" nillable="true" ma:displayName="MediaServiceSearchProperties" ma:hidden="true" ma:internalName="MediaServiceSearchProperties" ma:readOnly="true">
-      <xsd:simpleType>
-        <xsd:restriction base="dms:Note"/>
-      </xsd:simpleType>
-    </xsd:element>
-    <xsd:element name="MediaServiceDocTags" ma:index="30" nillable="true" ma:displayName="MediaServiceDocTags" ma:hidden="true" ma:internalName="MediaServiceDocTags" ma:readOnly="true">
-      <xsd:simpleType>
-        <xsd:restriction base="dms:Note"/>
-      </xsd:simpleType>
-    </xsd:element>
-    <xsd:element name="MediaServiceObjectDetectorVersions" ma:index="31" nillable="true" ma:displayName="MediaServiceObjectDetectorVersions" ma:description="" ma:hidden="true" ma:indexed="true" ma:internalName="MediaServiceObjectDetectorVersions" ma:readOnly="true">
-      <xsd:simpleType>
-        <xsd:restriction base="dms:Text"/>
-      </xsd:simpleType>
-    </xsd:element>
-    <xsd:element name="MediaServiceSystemTags" ma:index="32" nillable="true" ma:displayName="MediaServiceSystemTags" ma:hidden="true" ma:internalName="MediaServiceSystemTags" ma:readOnly="true">
-      <xsd:simpleType>
-        <xsd:restriction base="dms:Note"/>
-      </xsd:simpleType>
-    </xsd:element>
-    <xsd:element name="MediaServiceBillingMetadata" ma:index="33" nillable="true" ma:displayName="MediaServiceBillingMetadata" ma:hidden="true" ma:internalName="MediaServiceBillingMetadata" ma:readOnly="true">
-      <xsd:simpleType>
-        <xsd:restriction base="dms:Text"/>
-      </xsd:simpleType>
-    </xsd:element>
-  </xsd:schema>
-  <xsd:schema xmlns:xsd="http://www.w3.org/2001/XMLSchema" xmlns:xs="http://www.w3.org/2001/XMLSchema" xmlns:dms="http://schemas.microsoft.com/office/2006/documentManagement/types" xmlns:pc="http://schemas.microsoft.com/office/infopath/2007/PartnerControls" targetNamespace="16c05727-aa75-4e4a-9b5f-8a80a1165891" elementFormDefault="qualified">
-    <xsd:import namespace="http://schemas.microsoft.com/office/2006/documentManagement/types"/>
-    <xsd:import namespace="http://schemas.microsoft.com/office/infopath/2007/PartnerControls"/>
-    <xsd:element name="SharedWithUsers" ma:index="14" nillable="true" ma:displayName="Shared With" ma:hidden="true" ma:internalName="SharedWithUsers" ma:readOnly="true">
-      <xsd:complexType>
-        <xsd:complexContent>
-          <xsd:extension base="dms:UserMulti">
-            <xsd:sequence>
-              <xsd:element name="UserInfo" minOccurs="0" maxOccurs="unbounded">
-                <xsd:complexType>
-                  <xsd:sequence>
-                    <xsd:element name="DisplayName" type="xsd:string" minOccurs="0"/>
-                    <xsd:element name="AccountId" type="dms:UserId" minOccurs="0" nillable="true"/>
-                    <xsd:element name="AccountType" type="xsd:string" minOccurs="0"/>
-                  </xsd:sequence>
-                </xsd:complexType>
-              </xsd:element>
-            </xsd:sequence>
-          </xsd:extension>
-        </xsd:complexContent>
-      </xsd:complexType>
-    </xsd:element>
-    <xsd:element name="SharedWithDetails" ma:index="15" nillable="true" ma:displayName="Shared With Details" ma:hidden="true" ma:internalName="SharedWithDetails" ma:readOnly="true">
-      <xsd:simpleType>
-        <xsd:restriction base="dms:Note"/>
-      </xsd:simpleType>
-    </xsd:element>
-  </xsd:schema>
-  <xsd:schema xmlns:xsd="http://www.w3.org/2001/XMLSchema" xmlns:xs="http://www.w3.org/2001/XMLSchema" xmlns:dms="http://schemas.microsoft.com/office/2006/documentManagement/types" xmlns:pc="http://schemas.microsoft.com/office/infopath/2007/PartnerControls" targetNamespace="230e9df3-be65-4c73-a93b-d1236ebd677e" elementFormDefault="qualified">
-    <xsd:import namespace="http://schemas.microsoft.com/office/2006/documentManagement/types"/>
-    <xsd:import namespace="http://schemas.microsoft.com/office/infopath/2007/PartnerControls"/>
-    <xsd:element name="TaxCatchAll" ma:index="23" nillable="true" ma:displayName="Taxonomy Catch All Column" ma:hidden="true" ma:list="{3f6bfcbc-3db3-4ae6-bd76-326f0798ad28}" ma:internalName="TaxCatchAll" ma:readOnly="false" ma:showField="CatchAllData" ma:web="16c05727-aa75-4e4a-9b5f-8a80a1165891">
-      <xsd:complexType>
-        <xsd:complexContent>
-          <xsd:extension base="dms:MultiChoiceLookup">
-            <xsd:sequence>
-              <xsd:element name="Value" type="dms:Lookup" maxOccurs="unbounded" minOccurs="0" nillable="true"/>
-            </xsd:sequence>
-          </xsd:extension>
-        </xsd:complexContent>
-      </xsd:complexType>
-    </xsd:element>
-  </xsd:schema>
-  <xsd:schema xmlns="http://schemas.openxmlformats.org/package/2006/metadata/core-properties" xmlns:xsd="http://www.w3.org/2001/XMLSchema" xmlns:xsi="http://www.w3.org/2001/XMLSchema-instance" xmlns:dc="http://purl.org/dc/elements/1.1/" xmlns:dcterms="http://purl.org/dc/terms/" xmlns:odoc="http://schemas.microsoft.com/internal/obd" targetNamespace="http://schemas.openxmlformats.org/package/2006/metadata/core-properties" elementFormDefault="qualified" attributeFormDefault="unqualified" blockDefault="#all">
-    <xsd:import namespace="http://purl.org/dc/elements/1.1/" schemaLocation="http://dublincore.org/schemas/xmls/qdc/2003/04/02/dc.xsd"/>
-    <xsd:import namespace="http://purl.org/dc/terms/" schemaLocation="http://dublincore.org/schemas/xmls/qdc/2003/04/02/dcterms.xsd"/>
-    <xsd:element name="coreProperties" type="CT_coreProperties"/>
-    <xsd:complexType name="CT_coreProperties">
-      <xsd:all>
-        <xsd:element ref="dc:creator" minOccurs="0" maxOccurs="1"/>
-        <xsd:element ref="dcterms:created" minOccurs="0" maxOccurs="1"/>
-        <xsd:element ref="dc:identifier" minOccurs="0" maxOccurs="1"/>
-        <xsd:element name="contentType" minOccurs="0" maxOccurs="1" type="xsd:string" ma:displayName="Content Type"/>
-        <xsd:element ref="dc:title" minOccurs="0" maxOccurs="1" ma:index="1" ma:displayName="Title"/>
-        <xsd:element ref="dc:subject" minOccurs="0" maxOccurs="1"/>
-        <xsd:element ref="dc:description" minOccurs="0" maxOccurs="1"/>
-        <xsd:element name="keywords" minOccurs="0" maxOccurs="1" type="xsd:string"/>
-        <xsd:element ref="dc:language" minOccurs="0" maxOccurs="1"/>
-        <xsd:element name="category" minOccurs="0" maxOccurs="1" type="xsd:string"/>
-        <xsd:element name="version" minOccurs="0" maxOccurs="1" type="xsd:string"/>
-        <xsd:element name="revision" minOccurs="0" maxOccurs="1" type="xsd:string">
-          <xsd:annotation>
-            <xsd:documentation>
-                        This value indicates the number of saves or revisions. The application is responsible for updating this value after each revision.
-                    </xsd:documentation>
-          </xsd:annotation>
-        </xsd:element>
-        <xsd:element name="lastModifiedBy" minOccurs="0" maxOccurs="1" type="xsd:string"/>
-        <xsd:element ref="dcterms:modified" minOccurs="0" maxOccurs="1"/>
-        <xsd:element name="contentStatus" minOccurs="0" maxOccurs="1" type="xsd:string"/>
-      </xsd:all>
-    </xsd:complexType>
-  </xsd:schema>
-  <xs:schema xmlns:pc="http://schemas.microsoft.com/office/infopath/2007/PartnerControls" xmlns:xs="http://www.w3.org/2001/XMLSchema" targetNamespace="http://schemas.microsoft.com/office/infopath/2007/PartnerControls" elementFormDefault="qualified" attributeFormDefault="unqualified">
-    <xs:element name="Person">
-      <xs:complexType>
-        <xs:sequence>
-          <xs:element ref="pc:DisplayName" minOccurs="0"/>
-          <xs:element ref="pc:AccountId" minOccurs="0"/>
-          <xs:element ref="pc:AccountType" minOccurs="0"/>
-        </xs:sequence>
-      </xs:complexType>
-    </xs:element>
-    <xs:element name="DisplayName" type="xs:string"/>
-    <xs:element name="AccountId" type="xs:string"/>
-    <xs:element name="AccountType" type="xs:string"/>
-    <xs:element name="BDCAssociatedEntity">
-      <xs:complexType>
-        <xs:sequence>
-          <xs:element ref="pc:BDCEntity" minOccurs="0" maxOccurs="unbounded"/>
-        </xs:sequence>
-        <xs:attribute ref="pc:EntityNamespace"/>
-        <xs:attribute ref="pc:EntityName"/>
-        <xs:attribute ref="pc:SystemInstanceName"/>
-        <xs:attribute ref="pc:AssociationName"/>
-      </xs:complexType>
-    </xs:element>
-    <xs:attribute name="EntityNamespace" type="xs:string"/>
-    <xs:attribute name="EntityName" type="xs:string"/>
-    <xs:attribute name="SystemInstanceName" type="xs:string"/>
-    <xs:attribute name="AssociationName" type="xs:string"/>
-    <xs:element name="BDCEntity">
-      <xs:complexType>
-        <xs:sequence>
-          <xs:element ref="pc:EntityDisplayName" minOccurs="0"/>
-          <xs:element ref="pc:EntityInstanceReference" minOccurs="0"/>
-          <xs:element ref="pc:EntityId1" minOccurs="0"/>
-          <xs:element ref="pc:EntityId2" minOccurs="0"/>
-          <xs:element ref="pc:EntityId3" minOccurs="0"/>
-          <xs:element ref="pc:EntityId4" minOccurs="0"/>
-          <xs:element ref="pc:EntityId5" minOccurs="0"/>
-        </xs:sequence>
-      </xs:complexType>
-    </xs:element>
-    <xs:element name="EntityDisplayName" type="xs:string"/>
-    <xs:element name="EntityInstanceReference" type="xs:string"/>
-    <xs:element name="EntityId1" type="xs:string"/>
-    <xs:element name="EntityId2" type="xs:string"/>
-    <xs:element name="EntityId3" type="xs:string"/>
-    <xs:element name="EntityId4" type="xs:string"/>
-    <xs:element name="EntityId5" type="xs:string"/>
-    <xs:element name="Terms">
-      <xs:complexType>
-        <xs:sequence>
-          <xs:element ref="pc:TermInfo" minOccurs="0" maxOccurs="unbounded"/>
-        </xs:sequence>
-      </xs:complexType>
-    </xs:element>
-    <xs:element name="TermInfo">
-      <xs:complexType>
-        <xs:sequence>
-          <xs:element ref="pc:TermName" minOccurs="0"/>
-          <xs:element ref="pc:TermId" minOccurs="0"/>
-        </xs:sequence>
-      </xs:complexType>
-    </xs:element>
-    <xs:element name="TermName" type="xs:string"/>
-    <xs:element name="TermId" type="xs:string"/>
-  </xs:schema>
-</ct:contentTypeSchema>
-</file>
-
-<file path=customXml\item4.xml><?xml version="1.0" encoding="utf-8"?>
-<?mso-contentType ?>
-<FormTemplates xmlns="http://schemas.microsoft.com/sharepoint/v3/contenttype/forms">
-  <Display>DocumentLibraryForm</Display>
-  <Edit>DocumentLibraryForm</Edit>
-  <New>DocumentLibraryForm</New>
-</FormTemplates>
-</file>
-
-<file path=customXml\itemProps1.xml><?xml version="1.0" encoding="utf-8"?>
-<ds:datastoreItem xmlns:ds="http://schemas.openxmlformats.org/officeDocument/2006/customXml" ds:itemID="{BE71A2AA-C2C2-45EF-9CEB-115274F5DFE8}">
-  <ds:schemaRefs>
-    <ds:schemaRef ds:uri="http://schemas.microsoft.com/office/2006/metadata/properties"/>
-    <ds:schemaRef ds:uri="http://schemas.microsoft.com/office/infopath/2007/PartnerControls"/>
-    <ds:schemaRef ds:uri="http://schemas.microsoft.com/sharepoint/v3"/>
-    <ds:schemaRef ds:uri="230e9df3-be65-4c73-a93b-d1236ebd677e"/>
-    <ds:schemaRef ds:uri="71af3243-3dd4-4a8d-8c0d-dd76da1f02a5"/>
-    <ds:schemaRef ds:uri="16c05727-aa75-4e4a-9b5f-8a80a1165891"/>
-  </ds:schemaRefs>
-</ds:datastoreItem>
-</file>
-
-<file path=customXml\itemProps2.xml><?xml version="1.0" encoding="utf-8"?>
-<ds:datastoreItem xmlns:ds="http://schemas.openxmlformats.org/officeDocument/2006/customXml" ds:itemID="{C6809C35-722C-423A-8C94-619EC051D659}">
-  <ds:schemaRefs>
-    <ds:schemaRef ds:uri="http://schemas.openxmlformats.org/officeDocument/2006/bibliography"/>
-  </ds:schemaRefs>
-</ds:datastoreItem>
-</file>
-
-<file path=customXml\itemProps3.xml><?xml version="1.0" encoding="utf-8"?>
-<ds:datastoreItem xmlns:ds="http://schemas.openxmlformats.org/officeDocument/2006/customXml" ds:itemID="{A561FEBE-91A1-4154-B6E6-5DDE7646706C}">
-  <ds:schemaRefs>
-    <ds:schemaRef ds:uri="http://schemas.microsoft.com/office/2006/metadata/contentType"/>
-    <ds:schemaRef ds:uri="http://schemas.microsoft.com/office/2006/metadata/properties/metaAttributes"/>
-    <ds:schemaRef ds:uri="http://www.w3.org/2001/XMLSchema"/>
-    <ds:schemaRef ds:uri="http://schemas.microsoft.com/office/2006/metadata/properties"/>
-    <ds:schemaRef ds:uri="http://schemas.microsoft.com/sharepoint/v3"/>
-    <ds:schemaRef ds:uri="71af3243-3dd4-4a8d-8c0d-dd76da1f02a5"/>
-    <ds:schemaRef ds:uri="16c05727-aa75-4e4a-9b5f-8a80a1165891"/>
-    <ds:schemaRef ds:uri="230e9df3-be65-4c73-a93b-d1236ebd677e"/>
-    <ds:schemaRef ds:uri="http://schemas.microsoft.com/office/2006/documentManagement/types"/>
-    <ds:schemaRef ds:uri="http://schemas.microsoft.com/office/infopath/2007/PartnerControls"/>
-    <ds:schemaRef ds:uri="http://schemas.openxmlformats.org/package/2006/metadata/core-properties"/>
-    <ds:schemaRef ds:uri="http://purl.org/dc/elements/1.1/"/>
-    <ds:schemaRef ds:uri="http://purl.org/dc/terms/"/>
-    <ds:schemaRef ds:uri="http://schemas.microsoft.com/internal/obd"/>
-  </ds:schemaRefs>
-</ds:datastoreItem>
-</file>
-
-<file path=customXml\itemProps4.xml><?xml version="1.0" encoding="utf-8"?>
-<ds:datastoreItem xmlns:ds="http://schemas.openxmlformats.org/officeDocument/2006/customXml" ds:itemID="{F8699671-72DE-4DE8-9995-CB14096EB6BE}">
-  <ds:schemaRefs>
-    <ds:schemaRef ds:uri="http://schemas.microsoft.com/sharepoint/v3/contenttype/forms"/>
-  </ds:schemaRefs>
-</ds:datastoreItem>
-</file>
-
-<file path=docMetadata\LabelInfo.xml><?xml version="1.0" encoding="utf-8"?>
-<clbl:labelList xmlns:clbl="http://schemas.microsoft.com/office/2020/mipLabelMetadata">
-  <clbl:label id="{ea60d57e-af5b-4752-ac57-3e4f28ca11dc}" enabled="1" method="Privileged" siteId="{36da45f1-dd2c-4d1f-af13-5abe46b99921}" removed="0"/>
-</clbl:labelList>
-</file>
-
-<file path=docProps\app.xml><?xml version="1.0" encoding="utf-8"?>
-<Properties xmlns="http://schemas.openxmlformats.org/officeDocument/2006/extended-properties" xmlns:vt="http://schemas.openxmlformats.org/officeDocument/2006/docPropsVTypes">
-  <Template>Bold operations manager resume</Template>
-  <TotalTime>1708</TotalTime>
-  <Pages>1</Pages>
-  <Words>7</Words>
-  <Characters>51</Characters>
-  <Application>Microsoft Office Word</Application>
-  <DocSecurity>0</DocSecurity>
-  <Lines>17</Lines>
-  <Paragraphs>5</Paragraphs>
-  <ScaleCrop>false</ScaleCrop>
-  <HeadingPairs>
-    <vt:vector size="2" baseType="variant">
-      <vt:variant>
-        <vt:lpstr>Title</vt:lpstr>
-      </vt:variant>
-      <vt:variant>
-        <vt:i4>1</vt:i4>
-      </vt:variant>
-    </vt:vector>
-  </HeadingPairs>
-  <TitlesOfParts>
-    <vt:vector size="1" baseType="lpstr">
-      <vt:lpstr/>
-    </vt:vector>
-  </TitlesOfParts>
-  <Company/>
-  <LinksUpToDate>false</LinksUpToDate>
-  <CharactersWithSpaces>53</CharactersWithSpaces>
-  <SharedDoc>false</SharedDoc>
-  <HyperlinksChanged>false</HyperlinksChanged>
-  <AppVersion>16.0000</AppVersion>
-</Properties>
-</file>
-
-<file path=docProps\core.xml><?xml version="1.0" encoding="utf-8"?>
-<cp:coreProperties xmlns:cp="http://schemas.openxmlformats.org/package/2006/metadata/core-properties" xmlns:dc="http://purl.org/dc/elements/1.1/" xmlns:dcterms="http://purl.org/dc/terms/" xmlns:dcmitype="http://purl.org/dc/dcmitype/" xmlns:xsi="http://www.w3.org/2001/XMLSchema-instance">
-  <dc:title/>
-  <dc:subject/>
-  <dc:creator>Lewin, Murray</dc:creator>
-  <cp:keywords/>
-  <dc:description/>
-  <cp:lastModifiedBy>Lewin, Murray</cp:lastModifiedBy>
-  <cp:revision>98</cp:revision>
-  <cp:lastPrinted>2025-08-29T03:49:00Z</cp:lastPrinted>
-  <dcterms:created xsi:type="dcterms:W3CDTF">2025-08-26T02:47:00Z</dcterms:created>
-  <dcterms:modified xsi:type="dcterms:W3CDTF">2026-07-28T01:51:00Z</dcterms:modified>
-</cp:coreProperties>
-</file>
-
-<file path=docProps\custom.xml><?xml version="1.0" encoding="utf-8"?>
-<Properties xmlns="http://schemas.openxmlformats.org/officeDocument/2006/custom-properties" xmlns:vt="http://schemas.openxmlformats.org/officeDocument/2006/docPropsVTypes">
-  <property fmtid="{D5CDD505-2E9C-101B-9397-08002B2CF9AE}" pid="2" name="ContentTypeId">
-    <vt:lpwstr>0x01010079F111ED35F8CC479449609E8A0923A6</vt:lpwstr>
-  </property>
-  <property fmtid="{D5CDD505-2E9C-101B-9397-08002B2CF9AE}" pid="3" name="MediaServiceImageTags">
-    <vt:lpwstr/>
-  </property>
-  <property fmtid="{D5CDD505-2E9C-101B-9397-08002B2CF9AE}" pid="4" name="Order">
-    <vt:r8>5357300</vt:r8>
-  </property>
-  <property fmtid="{D5CDD505-2E9C-101B-9397-08002B2CF9AE}" pid="5" name="xd_Signature">
-    <vt:bool>false</vt:bool>
-  </property>
-  <property fmtid="{D5CDD505-2E9C-101B-9397-08002B2CF9AE}" pid="6" name="xd_ProgID">
-    <vt:lpwstr/>
-  </property>
-  <property fmtid="{D5CDD505-2E9C-101B-9397-08002B2CF9AE}" pid="7" name="TemplateUrl">
-    <vt:lpwstr/>
-  </property>
-  <property fmtid="{D5CDD505-2E9C-101B-9397-08002B2CF9AE}" pid="8" name="ComplianceAssetId">
-    <vt:lpwstr/>
-  </property>
-  <property fmtid="{D5CDD505-2E9C-101B-9397-08002B2CF9AE}" pid="9" name="_ExtendedDescription">
-    <vt:lpwstr/>
-  </property>
-  <property fmtid="{D5CDD505-2E9C-101B-9397-08002B2CF9AE}" pid="10" name="TriggerFlowInfo">
-    <vt:lpwstr/>
-  </property>
-</Properties>
-</file>
-
-<file path=word\document.xml><?xml version="1.0" encoding="utf-8"?>
+<file path=word/document.xml><?xml version="1.0" encoding="utf-8"?>
 <w:document xmlns:wpc="http://schemas.microsoft.com/office/word/2010/wordprocessingCanvas" xmlns:cx="http://schemas.microsoft.com/office/drawing/2014/chartex" xmlns:cx1="http://schemas.microsoft.com/office/drawing/2015/9/8/chartex" xmlns:cx2="http://schemas.microsoft.com/office/drawing/2015/10/21/chartex" xmlns:cx3="http://schemas.microsoft.com/office/drawing/2016/5/9/chartex" xmlns:cx4="http://schemas.microsoft.com/office/drawing/2016/5/10/chartex" xmlns:cx5="http://schemas.microsoft.com/office/drawing/2016/5/11/chartex" xmlns:cx6="http://schemas.microsoft.com/office/drawing/2016/5/12/chartex" xmlns:cx7="http://schemas.microsoft.com/office/drawing/2016/5/13/chartex" xmlns:cx8="http://schemas.microsoft.com/office/drawing/2016/5/14/chartex" xmlns:mc="http://schemas.openxmlformats.org/markup-compatibility/2006" xmlns:aink="http://schemas.microsoft.com/office/drawing/2016/ink" xmlns:am3d="http://schemas.microsoft.com/office/drawing/2017/model3d" xmlns:o="urn:schemas-microsoft-com:office:office" xmlns:oel="http://schemas.microsoft.com/office/2019/extlst" xmlns:r="http://schemas.openxmlformats.org/officeDocument/2006/relationships" xmlns:m="http://schemas.openxmlformats.org/officeDocument/2006/math" xmlns:v="urn:schemas-microsoft-com:vml" xmlns:wp14="http://schemas.microsoft.com/office/word/2010/wordprocessingDrawing" xmlns:wp="http://schemas.openxmlformats.org/drawingml/2006/wordprocessingDrawing" xmlns:w10="urn:schemas-microsoft-com:office:word" xmlns:w="http://schemas.openxmlformats.org/wordprocessingml/2006/main" xmlns:w14="http://schemas.microsoft.com/office/word/2010/wordml" xmlns:w15="http://schemas.microsoft.com/office/word/2012/wordml" xmlns:w16cex="http://schemas.microsoft.com/office/word/2018/wordml/cex" xmlns:w16cid="http://schemas.microsoft.com/office/word/2016/wordml/cid" xmlns:w16="http://schemas.microsoft.com/office/word/2018/wordml" xmlns:w16du="http://schemas.microsoft.com/office/word/2023/wordml/word16du" xmlns:w16sdtdh="http://schemas.microsoft.com/office/word/2020/wordml/sdtdatahash" xmlns:w16sdtfl="http://schemas.microsoft.com/office/word/2024/wordml/sdtformatlock" xmlns:w16se="http://schemas.microsoft.com/office/word/2015/wordml/symex" xmlns:wpg="http://schemas.microsoft.com/office/word/2010/wordprocessingGroup" xmlns:wpi="http://schemas.microsoft.com/office/word/2010/wordprocessingInk" xmlns:wne="http://schemas.microsoft.com/office/word/2006/wordml" xmlns:wps="http://schemas.microsoft.com/office/word/2010/wordprocessingShape" mc:Ignorable="w14 w15 w16se w16cid w16 w16cex w16sdtdh w16sdtfl w16du wp14">
   <w:body>
     <w:p>
-      <w:r xmlns:w="http://schemas.openxmlformats.org/wordprocessingml/2006/main" xmlns:wp="http://schemas.openxmlformats.org/drawingml/2006/wordprocessingDrawing" xmlns:a="http://schemas.openxmlformats.org/drawingml/2006/main" xmlns:pic="http://schemas.openxmlformats.org/drawingml/2006/picture" xmlns:r="http://schemas.openxmlformats.org/officeDocument/2006/relationships">
+      <w:r>
+        <w:rPr>
+          <w:noProof/>
+        </w:rPr>
         <w:drawing>
-          <wp:inline distT="0" distB="0" distL="0" distR="0">
+          <wp:inline distT="0" distB="0" distL="0" distR="0" wp14:anchorId="565B93AF" wp14:editId="123D7C37">
             <wp:extent cx="914400" cy="914400"/>
+            <wp:effectExtent l="0" t="0" r="0" b="0"/>
             <wp:docPr id="9001" name="Profile photo" descr="Portrait of Murray Lewin"/>
-            <a:graphic>
+            <wp:cNvGraphicFramePr/>
+            <a:graphic xmlns:a="http://schemas.openxmlformats.org/drawingml/2006/main">
               <a:graphicData uri="http://schemas.openxmlformats.org/drawingml/2006/picture">
-                <pic:pic>
+                <pic:pic xmlns:pic="http://schemas.openxmlformats.org/drawingml/2006/picture">
                   <pic:nvPicPr>
                     <pic:cNvPr id="0" name="profile-photo.jpg"/>
                     <pic:cNvPicPr/>
                   </pic:nvPicPr>
                   <pic:blipFill>
-                    <a:blip r:embed="rIdProfilePhoto"/>
+                    <a:blip r:embed="rId9"/>
                     <a:stretch>
                       <a:fillRect/>
                     </a:stretch>
@@ -533,11 +41,6 @@
           </wp:inline>
         </w:drawing>
       </w:r>
-      <w:pPr>
-        <w:rPr>
-          <w:vertAlign w:val="subscript"/>
-        </w:rPr>
-      </w:pPr>
       <w:r>
         <w:rPr>
           <w:noProof/>
@@ -569,7 +72,7 @@
                     </pic:cNvPicPr>
                   </pic:nvPicPr>
                   <pic:blipFill rotWithShape="1">
-                    <a:blip r:embed="rId9">
+                    <a:blip r:embed="rId10">
                       <a:extLst>
                         <a:ext uri="{28A0092B-C50C-407E-A947-70E740481C1C}">
                           <a14:useLocalDpi xmlns:a14="http://schemas.microsoft.com/office/drawing/2010/main" val="0"/>
@@ -1573,7 +1076,7 @@
                                 <w:sz w:val="20"/>
                                 <w:szCs w:val="22"/>
                               </w:rPr>
-                              <w:t xml:space="preserve">SAP</w:t>
+                              <w:t>SAP</w:t>
                             </w:r>
                           </w:p>
                           <w:p>
@@ -1591,7 +1094,7 @@
                                 <w:sz w:val="20"/>
                                 <w:szCs w:val="22"/>
                               </w:rPr>
-                              <w:t xml:space="preserve">Python, SQL &amp; MATLAB</w:t>
+                              <w:t>Python, SQL &amp; MATLAB</w:t>
                             </w:r>
                           </w:p>
                           <w:p>
@@ -1609,7 +1112,7 @@
                                 <w:sz w:val="20"/>
                                 <w:szCs w:val="22"/>
                               </w:rPr>
-                              <w:t xml:space="preserve">React / TypeScript &amp; FastAPI</w:t>
+                              <w:t>React / TypeScript &amp; FastAPI</w:t>
                             </w:r>
                           </w:p>
                           <w:p>
@@ -1627,7 +1130,7 @@
                                 <w:sz w:val="20"/>
                                 <w:szCs w:val="22"/>
                               </w:rPr>
-                              <w:t xml:space="preserve">Databricks &amp; PostgreSQL</w:t>
+                              <w:t>Databricks &amp; PostgreSQL</w:t>
                             </w:r>
                           </w:p>
                           <w:p>
@@ -1645,7 +1148,7 @@
                                 <w:sz w:val="20"/>
                                 <w:szCs w:val="22"/>
                               </w:rPr>
-                              <w:t xml:space="preserve">AWS, Azure &amp; Docker</w:t>
+                              <w:t>AWS, Azure &amp; Docker</w:t>
                             </w:r>
                           </w:p>
                           <w:p>
@@ -1663,7 +1166,7 @@
                                 <w:sz w:val="20"/>
                                 <w:szCs w:val="22"/>
                               </w:rPr>
-                              <w:t xml:space="preserve">Power BI, Power Apps &amp; Git</w:t>
+                              <w:t>Power BI, Power Apps &amp; Git</w:t>
                             </w:r>
                           </w:p>
                           <w:p>
@@ -1944,7 +1447,7 @@
                                 <w:sz w:val="20"/>
                                 <w:szCs w:val="20"/>
                               </w:rPr>
-                              <w:t xml:space="preserve">I am a consultant engineer in Deloitteâ€™s Strategy, Risk and Transactions practice, within the specialist asset management team. My work centres on maintenance strategy optimisation, reliability analysis and the maintenance master data that underpins both.</w:t>
+                              <w:t>I am a consultant engineer in Deloitteâ€™s Strategy, Risk and Transactions practice, within the specialist asset management team. My work centres on maintenance strategy optimisation, reliability analysis and the maintenance master data that underpins both.</w:t>
                             </w:r>
                           </w:p>
                           <w:p>
@@ -1967,7 +1470,7 @@
                                 <w:sz w:val="20"/>
                                 <w:szCs w:val="20"/>
                               </w:rPr>
-                              <w:t xml:space="preserve">FORTESCUE â€“ ASSET MAINTENANCE SPECIALIST</w:t>
+                              <w:t>FORTESCUE â€“ ASSET MAINTENANCE SPECIALIST</w:t>
                             </w:r>
                           </w:p>
                           <w:p>
@@ -1986,7 +1489,7 @@
                                 <w:sz w:val="20"/>
                                 <w:szCs w:val="20"/>
                               </w:rPr>
-                              <w:t xml:space="preserve">I heard about this role through my brother, who works at Fortescue, and it stood out immediately. Most of my work sits in maintenance strategy optimisation and the master data underneath it â€“ FLOC hierarchies, BOM validation, material classification and work order coding â€“ because a strategy is only ever as good as the data it runs on. The past two years have been spent turning messy SAP and operational data into reliability insight, defect elimination and better work management. Fortescueâ€™s approach of leading through doing, and the chance to build proof-of-concept tools alongside software and data engineers rather than hand requirements over, is exactly the environment I am looking for.</w:t>
+                              <w:t>I heard about this role through my brother, who works at Fortescue, and it stood out immediately. Most of my work sits in maintenance strategy optimisation and the master data underneath it â€“ FLOC hierarchies, BOM validation, material classification and work order coding â€“ because a strategy is only ever as good as the data it runs on. The past two years have been spent turning messy SAP and operational data into reliability insight, defect elimination and better work management. Fortescueâ€™s approach of leading through doing, and the chance to build proof-of-concept tools alongside software and data engineers rather than hand requirements over, is exactly the environment I am looking for.</w:t>
                             </w:r>
                           </w:p>
                         </w:txbxContent>
@@ -2289,7 +1792,7 @@
                                 <w:sz w:val="20"/>
                                 <w:szCs w:val="28"/>
                               </w:rPr>
-                              <w:t xml:space="preserve">Global Iron Ore Producer (Pilbara)</w:t>
+                              <w:t>Global Iron Ore Producer (Pilbara)</w:t>
                             </w:r>
                           </w:p>
                           <w:p>
@@ -2366,7 +1869,7 @@
                                 <w:sz w:val="20"/>
                                 <w:szCs w:val="28"/>
                               </w:rPr>
-                              <w:t xml:space="preserve">As part of a multi-disciplinary delivery team, I helped build a full-stack, cloud-native AI application that modernises and automates maintenance strategy processes across Heavy Mobile Equipment (HME) and Fixed Plant (FXP) assets for a global iron ore producer. It replaces fragmented, manual engineering workflows with AI-augmented data review, statistical reliability modelling and data-driven maintenance optimisation, integrating Databricks and SAP work order data for traceability through to validated maintenance recommendations. My contribution spanned reliability modelling, application features and data visualisation, alongside the teamâ€™s LLM specialists. The product is rolling out to production, with projected annual savings of $35 million.</w:t>
+                              <w:t>As part of a multi-disciplinary delivery team, I helped build a full-stack, cloud-native AI application that modernises and automates maintenance strategy processes across Heavy Mobile Equipment (HME) and Fixed Plant (FXP) assets for a global iron ore producer. It replaces fragmented, manual engineering workflows with AI-augmented data review, statistical reliability modelling and data-driven maintenance optimisation, integrating Databricks and SAP work order data for traceability through to validated maintenance recommendations. My contribution spanned reliability modelling, application features and data visualisation, alongside the teamâ€™s LLM specialists. The product is rolling out to production, with projected annual savings of $35 million.</w:t>
                             </w:r>
                           </w:p>
                           <w:p>
@@ -2389,7 +1892,7 @@
                                 <w:sz w:val="20"/>
                                 <w:szCs w:val="28"/>
                               </w:rPr>
-                              <w:t xml:space="preserve">Maintenance master data - human-in-the-loop review of AI-generated material classifications, FLOC BOM validation and work order classification.</w:t>
+                              <w:t>Maintenance master data - human-in-the-loop review of AI-generated material classifications, FLOC BOM validation and work order classification.</w:t>
                             </w:r>
                           </w:p>
                           <w:p>
@@ -2412,7 +1915,7 @@
                                 <w:sz w:val="20"/>
                                 <w:szCs w:val="28"/>
                               </w:rPr>
-                              <w:t xml:space="preserve">Reliability engineering - Weibull analysis, MTBF/MTTF calculation, Asset Health Index scoring, component age analysis and replacement projection modelling.</w:t>
+                              <w:t>Reliability engineering - Weibull analysis, MTBF/MTTF calculation, Asset Health Index scoring, component age analysis and replacement projection modelling.</w:t>
                             </w:r>
                           </w:p>
                           <w:p>
@@ -2435,7 +1938,7 @@
                                 <w:sz w:val="20"/>
                                 <w:szCs w:val="28"/>
                               </w:rPr>
-                              <w:t xml:space="preserve">Maintenance strategy optimisation - turning reliability outputs into data-driven maintenance tactic and component replacement recommendations for engineer sign-off.</w:t>
+                              <w:t>Maintenance strategy optimisation - turning reliability outputs into data-driven maintenance tactic and component replacement recommendations for engineer sign-off.</w:t>
                             </w:r>
                           </w:p>
                           <w:p>
@@ -2458,7 +1961,7 @@
                                 <w:sz w:val="20"/>
                                 <w:szCs w:val="28"/>
                               </w:rPr>
-                              <w:t xml:space="preserve">Full-stack development - React/TypeScript front-end features and Python/FastAPI REST endpoints.</w:t>
+                              <w:t>Full-stack development - React/TypeScript front-end features and Python/FastAPI REST endpoints.</w:t>
                             </w:r>
                           </w:p>
                           <w:p>
@@ -2481,7 +1984,7 @@
                                 <w:sz w:val="20"/>
                                 <w:szCs w:val="28"/>
                               </w:rPr>
-                              <w:t xml:space="preserve">Data engineering &amp; cloud - Databricks Gold-layer products and SAP work order data into a PostgreSQL database, deployed on Azure Container Apps.</w:t>
+                              <w:t>Data engineering &amp; cloud - Databricks Gold-layer products and SAP work order data into a PostgreSQL database, deployed on Azure Container Apps.</w:t>
                             </w:r>
                           </w:p>
                           <w:p>
@@ -2504,7 +2007,7 @@
                                 <w:sz w:val="20"/>
                                 <w:szCs w:val="28"/>
                               </w:rPr>
-                              <w:t xml:space="preserve">Data visualisation - Weibull curves, age analysis timelines and health index dashboards using Plotly.js.</w:t>
+                              <w:t>Data visualisation - Weibull curves, age analysis timelines and health index dashboards using Plotly.js.</w:t>
                             </w:r>
                           </w:p>
                           <w:p>
@@ -2962,13 +2465,13 @@
                           </pic:cNvPicPr>
                         </pic:nvPicPr>
                         <pic:blipFill>
-                          <a:blip r:embed="rId10" cstate="print">
+                          <a:blip r:embed="rId11" cstate="print">
                             <a:extLst>
                               <a:ext uri="{28A0092B-C50C-407E-A947-70E740481C1C}">
                                 <a14:useLocalDpi xmlns:a14="http://schemas.microsoft.com/office/drawing/2010/main" val="0"/>
                               </a:ext>
                               <a:ext uri="{96DAC541-7B7A-43D3-8B79-37D633B846F1}">
-                                <asvg:svgBlip xmlns:asvg="http://schemas.microsoft.com/office/drawing/2016/SVG/main" r:embed="rId11"/>
+                                <asvg:svgBlip xmlns:asvg="http://schemas.microsoft.com/office/drawing/2016/SVG/main" r:embed="rId12"/>
                               </a:ext>
                             </a:extLst>
                           </a:blip>
@@ -2994,13 +2497,13 @@
                           </pic:cNvPicPr>
                         </pic:nvPicPr>
                         <pic:blipFill>
-                          <a:blip r:embed="rId12" cstate="print">
+                          <a:blip r:embed="rId13" cstate="print">
                             <a:extLst>
                               <a:ext uri="{28A0092B-C50C-407E-A947-70E740481C1C}">
                                 <a14:useLocalDpi xmlns:a14="http://schemas.microsoft.com/office/drawing/2010/main" val="0"/>
                               </a:ext>
                               <a:ext uri="{96DAC541-7B7A-43D3-8B79-37D633B846F1}">
-                                <asvg:svgBlip xmlns:asvg="http://schemas.microsoft.com/office/drawing/2016/SVG/main" r:embed="rId13"/>
+                                <asvg:svgBlip xmlns:asvg="http://schemas.microsoft.com/office/drawing/2016/SVG/main" r:embed="rId14"/>
                               </a:ext>
                             </a:extLst>
                           </a:blip>
@@ -3026,13 +2529,13 @@
                           </pic:cNvPicPr>
                         </pic:nvPicPr>
                         <pic:blipFill>
-                          <a:blip r:embed="rId14" cstate="print">
+                          <a:blip r:embed="rId15" cstate="print">
                             <a:extLst>
                               <a:ext uri="{28A0092B-C50C-407E-A947-70E740481C1C}">
                                 <a14:useLocalDpi xmlns:a14="http://schemas.microsoft.com/office/drawing/2010/main" val="0"/>
                               </a:ext>
                               <a:ext uri="{96DAC541-7B7A-43D3-8B79-37D633B846F1}">
-                                <asvg:svgBlip xmlns:asvg="http://schemas.microsoft.com/office/drawing/2016/SVG/main" r:embed="rId15"/>
+                                <asvg:svgBlip xmlns:asvg="http://schemas.microsoft.com/office/drawing/2016/SVG/main" r:embed="rId16"/>
                               </a:ext>
                             </a:extLst>
                           </a:blip>
@@ -3058,10 +2561,10 @@
                           </pic:cNvPicPr>
                         </pic:nvPicPr>
                         <pic:blipFill>
-                          <a:blip r:embed="rId16">
+                          <a:blip r:embed="rId17">
                             <a:extLst>
                               <a:ext uri="{96DAC541-7B7A-43D3-8B79-37D633B846F1}">
-                                <asvg:svgBlip xmlns:asvg="http://schemas.microsoft.com/office/drawing/2016/SVG/main" r:embed="rId17"/>
+                                <asvg:svgBlip xmlns:asvg="http://schemas.microsoft.com/office/drawing/2016/SVG/main" r:embed="rId18"/>
                               </a:ext>
                             </a:extLst>
                           </a:blip>
@@ -3113,16 +2616,16 @@
                   <o:lock v:ext="edit" aspectratio="t"/>
                 </v:shapetype>
                 <v:shape id="Graphic 19" o:spid="_x0000_s1027" type="#_x0000_t75" style="position:absolute;width:1644;height:1625;visibility:visible;mso-wrap-style:square" o:gfxdata="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">
-                  <v:imagedata r:id="rId18" o:title=""/>
+                  <v:imagedata r:id="rId19" o:title=""/>
                 </v:shape>
                 <v:shape id="Graphic 22" o:spid="_x0000_s1028" type="#_x0000_t75" style="position:absolute;top:3258;width:1644;height:1626;visibility:visible;mso-wrap-style:square" o:gfxdata="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">
-                  <v:imagedata r:id="rId19" o:title=""/>
+                  <v:imagedata r:id="rId20" o:title=""/>
                 </v:shape>
                 <v:shape id="Graphic 23" o:spid="_x0000_s1029" type="#_x0000_t75" style="position:absolute;top:6420;width:1644;height:1625;visibility:visible;mso-wrap-style:square" o:gfxdata="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">
-                  <v:imagedata r:id="rId20" o:title=""/>
+                  <v:imagedata r:id="rId21" o:title=""/>
                 </v:shape>
                 <v:shape id="Graphic 24" o:spid="_x0000_s1030" type="#_x0000_t75" style="position:absolute;left:21;top:9581;width:1602;height:1626;visibility:visible;mso-wrap-style:square" o:gfxdata="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">
-                  <v:imagedata r:id="rId21" o:title=""/>
+                  <v:imagedata r:id="rId22" o:title=""/>
                 </v:shape>
                 <w10:wrap type="square" anchorx="page" anchory="page"/>
                 <w10:anchorlock/>
@@ -3257,7 +2760,7 @@
                                 <w:szCs w:val="20"/>
                               </w:rPr>
                             </w:pPr>
-                            <w:hyperlink r:id="rId22" w:history="1">
+                            <w:hyperlink r:id="rId23" w:history="1">
                               <w:r>
                                 <w:rPr>
                                   <w:rStyle w:val="Hyperlink"/>
@@ -3370,7 +2873,7 @@
                           <w:szCs w:val="20"/>
                         </w:rPr>
                       </w:pPr>
-                      <w:hyperlink r:id="rId23" w:history="1">
+                      <w:hyperlink r:id="rId24" w:history="1">
                         <w:r>
                           <w:rPr>
                             <w:rStyle w:val="Hyperlink"/>
@@ -3675,6 +3178,7 @@
         <w:pStyle w:val="Title2"/>
       </w:pPr>
       <w:r>
+        <w:lastRenderedPageBreak/>
         <w:t>Lewin</w:t>
       </w:r>
     </w:p>
@@ -3683,7 +3187,7 @@
         <w:pStyle w:val="Subtitle"/>
       </w:pPr>
       <w:r>
-        <w:t xml:space="preserve">Consultant Engineer</w:t>
+        <w:t>Consultant Engineer</w:t>
       </w:r>
     </w:p>
     <w:p>
@@ -3777,7 +3281,7 @@
                                 <w:sz w:val="24"/>
                                 <w:szCs w:val="24"/>
                               </w:rPr>
-                              <w:t xml:space="preserve">Volunteering</w:t>
+                              <w:t>Volunteering</w:t>
                             </w:r>
                           </w:p>
                           <w:p>
@@ -3847,7 +3351,6 @@
                                 <w:szCs w:val="20"/>
                               </w:rPr>
                             </w:pPr>
-                            <w:proofErr w:type="spellStart"/>
                             <w:r>
                               <w:rPr>
                                 <w:rFonts w:ascii="Aptos" w:hAnsi="Aptos"/>
@@ -3856,18 +3359,7 @@
                                 <w:sz w:val="18"/>
                                 <w:szCs w:val="20"/>
                               </w:rPr>
-                              <w:t>Ngalangangpum</w:t>
-                            </w:r>
-                            <w:proofErr w:type="spellEnd"/>
-                            <w:r>
-                              <w:rPr>
-                                <w:rFonts w:ascii="Aptos" w:hAnsi="Aptos"/>
-                                <w:b/>
-                                <w:bCs/>
-                                <w:sz w:val="18"/>
-                                <w:szCs w:val="20"/>
-                              </w:rPr>
-                              <w:t xml:space="preserve"> School â€“ Warmun Community</w:t>
+                              <w:t>Ngalangangpum School â€“ Warmun Community</w:t>
                             </w:r>
                           </w:p>
                           <w:p>
@@ -4462,117 +3954,7 @@
                                 <w:sz w:val="20"/>
                                 <w:szCs w:val="22"/>
                               </w:rPr>
-                              <w:t>Chris Shannen â€“ Deloitte</w:t>
-                            </w:r>
-                          </w:p>
-                          <w:p>
-                            <w:pPr>
-                              <w:pStyle w:val="Normalleftpanel"/>
-                              <w:jc w:val="left"/>
-                              <w:rPr>
-                                <w:rFonts w:ascii="Aptos" w:hAnsi="Aptos"/>
-                                <w:sz w:val="20"/>
-                                <w:szCs w:val="22"/>
-                              </w:rPr>
-                            </w:pPr>
-                            <w:r>
-                              <w:rPr>
-                                <w:rFonts w:ascii="Aptos" w:hAnsi="Aptos"/>
-                                <w:sz w:val="20"/>
-                                <w:szCs w:val="22"/>
-                              </w:rPr>
-                              <w:t>Role: Partner Asset Management Deloitte</w:t>
-                            </w:r>
-                          </w:p>
-                          <w:p>
-                            <w:pPr>
-                              <w:pStyle w:val="Normalleftpanel"/>
-                              <w:jc w:val="left"/>
-                              <w:rPr>
-                                <w:rFonts w:ascii="Aptos" w:hAnsi="Aptos"/>
-                                <w:sz w:val="20"/>
-                                <w:szCs w:val="22"/>
-                              </w:rPr>
-                            </w:pPr>
-                            <w:r>
-                              <w:rPr>
-                                <w:rFonts w:ascii="Aptos" w:hAnsi="Aptos"/>
-                                <w:sz w:val="20"/>
-                                <w:szCs w:val="22"/>
-                              </w:rPr>
-                              <w:t xml:space="preserve">Contact: </w:t>
-                            </w:r>
-                            <w:r>
-                              <w:rPr>
-                                <w:rFonts w:ascii="Aptos" w:hAnsi="Aptos"/>
-                                <w:sz w:val="20"/>
-                                <w:szCs w:val="22"/>
-                              </w:rPr>
-                              <w:t>0427 028 940</w:t>
-                            </w:r>
-                          </w:p>
-                          <w:p>
-                            <w:pPr>
-                              <w:pStyle w:val="Normalleftpanel"/>
-                              <w:jc w:val="left"/>
-                              <w:rPr>
-                                <w:rFonts w:ascii="Aptos" w:hAnsi="Aptos"/>
-                                <w:sz w:val="20"/>
-                                <w:szCs w:val="22"/>
-                              </w:rPr>
-                            </w:pPr>
-                          </w:p>
-                          <w:p>
-                            <w:pPr>
-                              <w:pStyle w:val="Normalleftpanel"/>
-                              <w:jc w:val="left"/>
-                              <w:rPr>
-                                <w:rFonts w:ascii="Aptos" w:hAnsi="Aptos"/>
-                                <w:b/>
-                                <w:bCs/>
-                                <w:sz w:val="20"/>
-                                <w:szCs w:val="22"/>
-                              </w:rPr>
-                            </w:pPr>
-                            <w:r>
-                              <w:rPr>
-                                <w:rFonts w:ascii="Aptos" w:hAnsi="Aptos"/>
-                                <w:b/>
-                                <w:bCs/>
-                                <w:sz w:val="20"/>
-                                <w:szCs w:val="22"/>
-                              </w:rPr>
-                              <w:t xml:space="preserve">Adrienne Holt </w:t>
-                            </w:r>
-                            <w:r>
-                              <w:rPr>
-                                <w:rFonts w:ascii="Aptos" w:hAnsi="Aptos"/>
-                                <w:b/>
-                                <w:bCs/>
-                                <w:sz w:val="20"/>
-                                <w:szCs w:val="22"/>
-                              </w:rPr>
-                              <w:t>â€“</w:t>
-                            </w:r>
-                            <w:r>
-                              <w:rPr>
-                                <w:rFonts w:ascii="Aptos" w:hAnsi="Aptos"/>
-                                <w:b/>
-                                <w:bCs/>
-                                <w:sz w:val="20"/>
-                                <w:szCs w:val="22"/>
-                              </w:rPr>
-                              <w:t xml:space="preserve"> Paramount</w:t>
-                            </w:r>
-                            <w:r>
-                              <w:rPr>
-                                <w:rFonts w:ascii="Aptos" w:hAnsi="Aptos"/>
-                                <w:b/>
-                                <w:bCs/>
-                                <w:sz w:val="20"/>
-                                <w:szCs w:val="22"/>
-                              </w:rPr>
-                              <w:t xml:space="preserve"> Purchasing</w:t>
+                              <w:t>Professional references are available upon request. Please feel welcome to get in touch if required.</w:t>
                             </w:r>
                           </w:p>
                           <w:p>
@@ -4648,7 +4030,11 @@
           </mc:Choice>
           <mc:Fallback>
             <w:pict>
-              <v:shape w14:anchorId="402F6157" id="Text Box 119957098" o:spid="_x0000_s1034" type="#_x0000_t202" style="position:absolute;left:0;text-align:left;margin-left:4.25pt;margin-top:484.65pt;width:156.2pt;height:225.5pt;z-index:251658253;visibility:visible;mso-wrap-style:square;mso-width-percent:0;mso-height-percent:0;mso-wrap-distance-left:9pt;mso-wrap-distance-top:3.6pt;mso-wrap-distance-right:9pt;mso-wrap-distance-bottom:3.6pt;mso-position-horizontal:absolute;mso-position-horizontal-relative:page;mso-position-vertical:absolute;mso-position-vertical-relative:page;mso-width-percent:0;mso-height-percent:0;mso-width-relative:margin;mso-height-relative:margin;v-text-anchor:top" o:gfxdata="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" filled="f" stroked="f">
+              <v:shapetype w14:anchorId="402F6157" id="_x0000_t202" coordsize="21600,21600" o:spt="202" path="m,l,21600r21600,l21600,xe">
+                <v:stroke joinstyle="miter"/>
+                <v:path gradientshapeok="t" o:connecttype="rect"/>
+              </v:shapetype>
+              <v:shape id="Text Box 119957098" o:spid="_x0000_s1034" type="#_x0000_t202" style="position:absolute;left:0;text-align:left;margin-left:4.25pt;margin-top:484.65pt;width:156.2pt;height:225.5pt;z-index:251658253;visibility:visible;mso-wrap-style:square;mso-width-percent:0;mso-height-percent:0;mso-wrap-distance-left:9pt;mso-wrap-distance-top:3.6pt;mso-wrap-distance-right:9pt;mso-wrap-distance-bottom:3.6pt;mso-position-horizontal:absolute;mso-position-horizontal-relative:page;mso-position-vertical:absolute;mso-position-vertical-relative:page;mso-width-percent:0;mso-height-percent:0;mso-width-relative:margin;mso-height-relative:margin;v-text-anchor:top" o:gfxdata="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" filled="f" stroked="f">
                 <v:textbox>
                   <w:txbxContent>
                     <w:p>
@@ -4689,117 +4075,7 @@
                           <w:sz w:val="20"/>
                           <w:szCs w:val="22"/>
                         </w:rPr>
-                        <w:t>Chris Shannen â€“ Deloitte</w:t>
-                      </w:r>
-                    </w:p>
-                    <w:p>
-                      <w:pPr>
-                        <w:pStyle w:val="Normalleftpanel"/>
-                        <w:jc w:val="left"/>
-                        <w:rPr>
-                          <w:rFonts w:ascii="Aptos" w:hAnsi="Aptos"/>
-                          <w:sz w:val="20"/>
-                          <w:szCs w:val="22"/>
-                        </w:rPr>
-                      </w:pPr>
-                      <w:r>
-                        <w:rPr>
-                          <w:rFonts w:ascii="Aptos" w:hAnsi="Aptos"/>
-                          <w:sz w:val="20"/>
-                          <w:szCs w:val="22"/>
-                        </w:rPr>
-                        <w:t>Role: Partner Asset Management Deloitte</w:t>
-                      </w:r>
-                    </w:p>
-                    <w:p>
-                      <w:pPr>
-                        <w:pStyle w:val="Normalleftpanel"/>
-                        <w:jc w:val="left"/>
-                        <w:rPr>
-                          <w:rFonts w:ascii="Aptos" w:hAnsi="Aptos"/>
-                          <w:sz w:val="20"/>
-                          <w:szCs w:val="22"/>
-                        </w:rPr>
-                      </w:pPr>
-                      <w:r>
-                        <w:rPr>
-                          <w:rFonts w:ascii="Aptos" w:hAnsi="Aptos"/>
-                          <w:sz w:val="20"/>
-                          <w:szCs w:val="22"/>
-                        </w:rPr>
-                        <w:t xml:space="preserve">Contact: </w:t>
-                      </w:r>
-                      <w:r>
-                        <w:rPr>
-                          <w:rFonts w:ascii="Aptos" w:hAnsi="Aptos"/>
-                          <w:sz w:val="20"/>
-                          <w:szCs w:val="22"/>
-                        </w:rPr>
-                        <w:t>0427 028 940</w:t>
-                      </w:r>
-                    </w:p>
-                    <w:p>
-                      <w:pPr>
-                        <w:pStyle w:val="Normalleftpanel"/>
-                        <w:jc w:val="left"/>
-                        <w:rPr>
-                          <w:rFonts w:ascii="Aptos" w:hAnsi="Aptos"/>
-                          <w:sz w:val="20"/>
-                          <w:szCs w:val="22"/>
-                        </w:rPr>
-                      </w:pPr>
-                    </w:p>
-                    <w:p>
-                      <w:pPr>
-                        <w:pStyle w:val="Normalleftpanel"/>
-                        <w:jc w:val="left"/>
-                        <w:rPr>
-                          <w:rFonts w:ascii="Aptos" w:hAnsi="Aptos"/>
-                          <w:b/>
-                          <w:bCs/>
-                          <w:sz w:val="20"/>
-                          <w:szCs w:val="22"/>
-                        </w:rPr>
-                      </w:pPr>
-                      <w:r>
-                        <w:rPr>
-                          <w:rFonts w:ascii="Aptos" w:hAnsi="Aptos"/>
-                          <w:b/>
-                          <w:bCs/>
-                          <w:sz w:val="20"/>
-                          <w:szCs w:val="22"/>
-                        </w:rPr>
-                        <w:t xml:space="preserve">Adrienne Holt </w:t>
-                      </w:r>
-                      <w:r>
-                        <w:rPr>
-                          <w:rFonts w:ascii="Aptos" w:hAnsi="Aptos"/>
-                          <w:b/>
-                          <w:bCs/>
-                          <w:sz w:val="20"/>
-                          <w:szCs w:val="22"/>
-                        </w:rPr>
-                        <w:t>â€“</w:t>
-                      </w:r>
-                      <w:r>
-                        <w:rPr>
-                          <w:rFonts w:ascii="Aptos" w:hAnsi="Aptos"/>
-                          <w:b/>
-                          <w:bCs/>
-                          <w:sz w:val="20"/>
-                          <w:szCs w:val="22"/>
-                        </w:rPr>
-                        <w:t xml:space="preserve"> Paramount</w:t>
-                      </w:r>
-                      <w:r>
-                        <w:rPr>
-                          <w:rFonts w:ascii="Aptos" w:hAnsi="Aptos"/>
-                          <w:b/>
-                          <w:bCs/>
-                          <w:sz w:val="20"/>
-                          <w:szCs w:val="22"/>
-                        </w:rPr>
-                        <w:t xml:space="preserve"> Purchasing</w:t>
+                        <w:t>Professional references are available upon request. Please feel welcome to get in touch if required.</w:t>
                       </w:r>
                     </w:p>
                     <w:p>
@@ -4950,7 +4226,7 @@
                                 <w:sz w:val="20"/>
                                 <w:szCs w:val="22"/>
                               </w:rPr>
-                              <w:t xml:space="preserve">Duke of Edinburgh Bronze Medallion</w:t>
+                              <w:t>Duke of Edinburgh Bronze Medallion</w:t>
                             </w:r>
                           </w:p>
                         </w:txbxContent>
@@ -5204,7 +4480,7 @@
                                 <w:sz w:val="20"/>
                                 <w:szCs w:val="28"/>
                               </w:rPr>
-                              <w:t xml:space="preserve">Global Gold Mining Operator</w:t>
+                              <w:t>Global Gold Mining Operator</w:t>
                             </w:r>
                           </w:p>
                           <w:p>
@@ -5227,7 +4503,7 @@
                                 <w:sz w:val="20"/>
                                 <w:szCs w:val="28"/>
                               </w:rPr>
-                              <w:t xml:space="preserve">Group Asset Management Framework (Phase 1 and 2), Consultant Engineer</w:t>
+                              <w:t>Group Asset Management Framework (Phase 1 and 2), Consultant Engineer</w:t>
                             </w:r>
                           </w:p>
                           <w:p>
@@ -5281,7 +4557,7 @@
                                 <w:sz w:val="20"/>
                                 <w:szCs w:val="28"/>
                               </w:rPr>
-                              <w:t xml:space="preserve">Group Asset Management Framework</w:t>
+                              <w:t>Group Asset Management Framework</w:t>
                             </w:r>
                           </w:p>
                           <w:p>
@@ -5299,7 +4575,7 @@
                                 <w:sz w:val="20"/>
                                 <w:szCs w:val="28"/>
                               </w:rPr>
-                              <w:t xml:space="preserve">Rolled out the group Asset Management Framework and System Definition. Defined Key Practice Areas, system requirements and documentation layout for a global gold mining operator. Worked with the central asset management team across Australia, Chile, South Africa, Ghana &amp; Canada to identify and align global frameworks.</w:t>
+                              <w:t>Rolled out the group Asset Management Framework and System Definition. Defined Key Practice Areas, system requirements and documentation layout for a global gold mining operator. Worked with the central asset management team across Australia, Chile, South Africa, Ghana &amp; Canada to identify and align global frameworks.</w:t>
                             </w:r>
                           </w:p>
                           <w:p>
@@ -5371,7 +4647,7 @@
                                 <w:sz w:val="20"/>
                                 <w:szCs w:val="28"/>
                               </w:rPr>
-                              <w:t xml:space="preserve">Facilitated international workshops across 5 countries, running sessions with central and site asset management teams.</w:t>
+                              <w:t>Facilitated international workshops across 5 countries, running sessions with central and site asset management teams.</w:t>
                             </w:r>
                           </w:p>
                           <w:p>
@@ -5405,7 +4681,7 @@
                                 <w:sz w:val="20"/>
                                 <w:szCs w:val="28"/>
                               </w:rPr>
-                              <w:t xml:space="preserve">Global Iron Ore Producer (Pilbara)</w:t>
+                              <w:t>Global Iron Ore Producer (Pilbara)</w:t>
                             </w:r>
                           </w:p>
                           <w:p>
@@ -5428,7 +4704,7 @@
                                 <w:sz w:val="20"/>
                                 <w:szCs w:val="28"/>
                               </w:rPr>
-                              <w:t xml:space="preserve">Asset Health Index Rollout (Fixed Plant), Consultant Engineer</w:t>
+                              <w:t>Asset Health Index Rollout (Fixed Plant), Consultant Engineer</w:t>
                             </w:r>
                           </w:p>
                           <w:p>
@@ -5482,7 +4758,7 @@
                                 <w:sz w:val="20"/>
                                 <w:szCs w:val="28"/>
                               </w:rPr>
-                              <w:t xml:space="preserve">Asset Health Index â€“ Pilbara Fixed Plant Sites</w:t>
+                              <w:t>Asset Health Index â€“ Pilbara Fixed Plant Sites</w:t>
                             </w:r>
                           </w:p>
                           <w:p>
@@ -5500,7 +4776,7 @@
                                 <w:sz w:val="20"/>
                                 <w:szCs w:val="28"/>
                               </w:rPr>
-                              <w:t xml:space="preserve">4/3 roster fly-in fly-out rollout and build of an Asset Health Index across two Pilbara sites, covering wet plant assets and low-grade fixed plant.</w:t>
+                              <w:t>4/3 roster fly-in fly-out rollout and build of an Asset Health Index across two Pilbara sites, covering wet plant assets and low-grade fixed plant.</w:t>
                             </w:r>
                           </w:p>
                           <w:p>
@@ -5606,7 +4882,7 @@
                                 <w:sz w:val="20"/>
                                 <w:szCs w:val="28"/>
                               </w:rPr>
-                              <w:t xml:space="preserve">Iron Ore Producer (Pilbara)</w:t>
+                              <w:t>Iron Ore Producer (Pilbara)</w:t>
                             </w:r>
                           </w:p>
                           <w:p>
@@ -5789,7 +5065,7 @@
                                 <w:sz w:val="20"/>
                                 <w:szCs w:val="28"/>
                               </w:rPr>
-                              <w:t xml:space="preserve">Global Iron Ore Producer (Pilbara)</w:t>
+                              <w:t>Global Iron Ore Producer (Pilbara)</w:t>
                             </w:r>
                           </w:p>
                           <w:p>
@@ -5866,7 +5142,7 @@
                                 <w:sz w:val="20"/>
                                 <w:szCs w:val="28"/>
                               </w:rPr>
-                              <w:t xml:space="preserve">Asset Management Plans â€“ Fixed Plant Substations</w:t>
+                              <w:t>Asset Management Plans â€“ Fixed Plant Substations</w:t>
                             </w:r>
                           </w:p>
                           <w:p>
@@ -5914,7 +5190,7 @@
                                 <w:sz w:val="20"/>
                                 <w:szCs w:val="28"/>
                               </w:rPr>
-                              <w:t xml:space="preserve">Substation site validation - checking that the correct regulatory precautions are taken in low voltage substations.</w:t>
+                              <w:t>Substation site validation - checking that the correct regulatory precautions are taken in low voltage substations.</w:t>
                             </w:r>
                           </w:p>
                           <w:p>
@@ -6865,7 +6141,7 @@
                                 <w:sz w:val="20"/>
                                 <w:szCs w:val="28"/>
                               </w:rPr>
-                              <w:t xml:space="preserve">Global Iron Ore Producer (Pilbara)</w:t>
+                              <w:t>Global Iron Ore Producer (Pilbara)</w:t>
                             </w:r>
                           </w:p>
                           <w:p>
@@ -6942,7 +6218,7 @@
                                 <w:sz w:val="20"/>
                                 <w:szCs w:val="28"/>
                               </w:rPr>
-                              <w:t xml:space="preserve">Asset Tactics Review â€“ Pilbara Operations</w:t>
+                              <w:t>Asset Tactics Review â€“ Pilbara Operations</w:t>
                             </w:r>
                           </w:p>
                           <w:p>
@@ -6966,7 +6242,7 @@
                                 <w:sz w:val="20"/>
                                 <w:szCs w:val="28"/>
                               </w:rPr>
-                              <w:t xml:space="preserve">Defect elimination - bad actor review identifying the worst performing site assets on the basis of downtime and associated criticality.</w:t>
+                              <w:t>Defect elimination - bad actor review identifying the worst performing site assets on the basis of downtime and associated criticality.</w:t>
                             </w:r>
                           </w:p>
                           <w:p>
@@ -6990,7 +6266,7 @@
                                 <w:sz w:val="20"/>
                                 <w:szCs w:val="28"/>
                               </w:rPr>
-                              <w:t xml:space="preserve">Work management - changeout analysis of SAP PM01, PM02 and PM03 notifications to find incomplete changeouts, notification timing issues and causes of unnecessary downtime.</w:t>
+                              <w:t>Work management - changeout analysis of SAP PM01, PM02 and PM03 notifications to find incomplete changeouts, notification timing issues and causes of unnecessary downtime.</w:t>
                             </w:r>
                           </w:p>
                           <w:p>
@@ -7014,7 +6290,7 @@
                                 <w:sz w:val="20"/>
                                 <w:szCs w:val="28"/>
                               </w:rPr>
-                              <w:t xml:space="preserve">Maintenance strategy documentation - PRT and task description review to find gaps or missing information that would make it difficult for an inspector to assess asset condition.</w:t>
+                              <w:t>Maintenance strategy documentation - PRT and task description review to find gaps or missing information that would make it difficult for an inspector to assess asset condition.</w:t>
                             </w:r>
                           </w:p>
                           <w:p>
@@ -7063,7 +6339,7 @@
                                 <w:sz w:val="20"/>
                                 <w:szCs w:val="28"/>
                               </w:rPr>
-                              <w:t xml:space="preserve">Macmahon</w:t>
+                              <w:t>Macmahon</w:t>
                             </w:r>
                           </w:p>
                           <w:p>
@@ -7140,7 +6416,7 @@
                                 <w:sz w:val="20"/>
                                 <w:szCs w:val="28"/>
                               </w:rPr>
-                              <w:t xml:space="preserve">Using SAP to re-issue stock items back into the storefront that werenâ€™t fitted from maintenance orders. Also preparing work orders for fitters and maintenance crew to perform routine fixes.</w:t>
+                              <w:t>Using SAP to re-issue stock items back into the storefront that werenâ€™t fitted from maintenance orders. Also preparing work orders for fitters and maintenance crew to perform routine fixes.</w:t>
                             </w:r>
                           </w:p>
                           <w:p>
@@ -8151,7 +7427,6 @@
         <w:rPr>
           <w:noProof/>
         </w:rPr>
-        <w:lastRenderedPageBreak/>
         <mc:AlternateContent>
           <mc:Choice Requires="wps">
             <w:drawing>
@@ -8241,74 +7516,7 @@
 </w:document>
 </file>
 
-<file path=word\fontTable.xml><?xml version="1.0" encoding="utf-8"?>
-<w:fonts xmlns:mc="http://schemas.openxmlformats.org/markup-compatibility/2006" xmlns:r="http://schemas.openxmlformats.org/officeDocument/2006/relationships" xmlns:w="http://schemas.openxmlformats.org/wordprocessingml/2006/main" xmlns:w14="http://schemas.microsoft.com/office/word/2010/wordml" xmlns:w15="http://schemas.microsoft.com/office/word/2012/wordml" xmlns:w16cex="http://schemas.microsoft.com/office/word/2018/wordml/cex" xmlns:w16cid="http://schemas.microsoft.com/office/word/2016/wordml/cid" xmlns:w16="http://schemas.microsoft.com/office/word/2018/wordml" xmlns:w16du="http://schemas.microsoft.com/office/word/2023/wordml/word16du" xmlns:w16sdtdh="http://schemas.microsoft.com/office/word/2020/wordml/sdtdatahash" xmlns:w16sdtfl="http://schemas.microsoft.com/office/word/2024/wordml/sdtformatlock" xmlns:w16se="http://schemas.microsoft.com/office/word/2015/wordml/symex" mc:Ignorable="w14 w15 w16se w16cid w16 w16cex w16sdtdh w16sdtfl w16du">
-  <w:font w:name="Symbol">
-    <w:panose1 w:val="05050102010706020507"/>
-    <w:charset w:val="02"/>
-    <w:family w:val="roman"/>
-    <w:pitch w:val="variable"/>
-    <w:sig w:usb0="00000000" w:usb1="10000000" w:usb2="00000000" w:usb3="00000000" w:csb0="80000000" w:csb1="00000000"/>
-  </w:font>
-  <w:font w:name="Times New Roman">
-    <w:panose1 w:val="02020603050405020304"/>
-    <w:charset w:val="00"/>
-    <w:family w:val="roman"/>
-    <w:pitch w:val="variable"/>
-    <w:sig w:usb0="E0002EFF" w:usb1="C000785B" w:usb2="00000009" w:usb3="00000000" w:csb0="000001FF" w:csb1="00000000"/>
-  </w:font>
-  <w:font w:name="Courier New">
-    <w:panose1 w:val="02070309020205020404"/>
-    <w:charset w:val="00"/>
-    <w:family w:val="modern"/>
-    <w:pitch w:val="fixed"/>
-    <w:sig w:usb0="E0002EFF" w:usb1="C0007843" w:usb2="00000009" w:usb3="00000000" w:csb0="000001FF" w:csb1="00000000"/>
-  </w:font>
-  <w:font w:name="Wingdings">
-    <w:panose1 w:val="05000000000000000000"/>
-    <w:charset w:val="02"/>
-    <w:family w:val="auto"/>
-    <w:pitch w:val="variable"/>
-    <w:sig w:usb0="00000000" w:usb1="10000000" w:usb2="00000000" w:usb3="00000000" w:csb0="80000000" w:csb1="00000000"/>
-  </w:font>
-  <w:font w:name="Aptos">
-    <w:charset w:val="00"/>
-    <w:family w:val="swiss"/>
-    <w:pitch w:val="variable"/>
-    <w:sig w:usb0="20000287" w:usb1="00000003" w:usb2="00000000" w:usb3="00000000" w:csb0="0000019F" w:csb1="00000000"/>
-  </w:font>
-  <w:font w:name="Arial">
-    <w:panose1 w:val="020B0604020202020204"/>
-    <w:charset w:val="00"/>
-    <w:family w:val="swiss"/>
-    <w:pitch w:val="variable"/>
-    <w:sig w:usb0="E0002EFF" w:usb1="C000785B" w:usb2="00000009" w:usb3="00000000" w:csb0="000001FF" w:csb1="00000000"/>
-  </w:font>
-  <w:font w:name="Verdana">
-    <w:panose1 w:val="020B0604030504040204"/>
-    <w:charset w:val="00"/>
-    <w:family w:val="swiss"/>
-    <w:pitch w:val="variable"/>
-    <w:sig w:usb0="A00006FF" w:usb1="4000205B" w:usb2="00000010" w:usb3="00000000" w:csb0="0000019F" w:csb1="00000000"/>
-  </w:font>
-  <w:font w:name="Baskerville Old Face">
-    <w:panose1 w:val="02020602080505020303"/>
-    <w:charset w:val="00"/>
-    <w:family w:val="roman"/>
-    <w:pitch w:val="variable"/>
-    <w:sig w:usb0="00000003" w:usb1="00000000" w:usb2="00000000" w:usb3="00000000" w:csb0="00000001" w:csb1="00000000"/>
-  </w:font>
-  <w:font w:name="Open Sans">
-    <w:panose1 w:val="020B0606030504020204"/>
-    <w:charset w:val="00"/>
-    <w:family w:val="swiss"/>
-    <w:pitch w:val="variable"/>
-    <w:sig w:usb0="E00002EF" w:usb1="4000205B" w:usb2="00000028" w:usb3="00000000" w:csb0="0000019F" w:csb1="00000000"/>
-  </w:font>
-</w:fonts>
-</file>
-
-<file path=word\numbering.xml><?xml version="1.0" encoding="utf-8"?>
+<file path=word/numbering.xml><?xml version="1.0" encoding="utf-8"?>
 <w:numbering xmlns:wpc="http://schemas.microsoft.com/office/word/2010/wordprocessingCanvas" xmlns:cx="http://schemas.microsoft.com/office/drawing/2014/chartex" xmlns:cx1="http://schemas.microsoft.com/office/drawing/2015/9/8/chartex" xmlns:cx2="http://schemas.microsoft.com/office/drawing/2015/10/21/chartex" xmlns:cx3="http://schemas.microsoft.com/office/drawing/2016/5/9/chartex" xmlns:cx4="http://schemas.microsoft.com/office/drawing/2016/5/10/chartex" xmlns:cx5="http://schemas.microsoft.com/office/drawing/2016/5/11/chartex" xmlns:cx6="http://schemas.microsoft.com/office/drawing/2016/5/12/chartex" xmlns:cx7="http://schemas.microsoft.com/office/drawing/2016/5/13/chartex" xmlns:cx8="http://schemas.microsoft.com/office/drawing/2016/5/14/chartex" xmlns:mc="http://schemas.openxmlformats.org/markup-compatibility/2006" xmlns:aink="http://schemas.microsoft.com/office/drawing/2016/ink" xmlns:am3d="http://schemas.microsoft.com/office/drawing/2017/model3d" xmlns:o="urn:schemas-microsoft-com:office:office" xmlns:oel="http://schemas.microsoft.com/office/2019/extlst" xmlns:r="http://schemas.openxmlformats.org/officeDocument/2006/relationships" xmlns:m="http://schemas.openxmlformats.org/officeDocument/2006/math" xmlns:v="urn:schemas-microsoft-com:vml" xmlns:wp14="http://schemas.microsoft.com/office/word/2010/wordprocessingDrawing" xmlns:wp="http://schemas.openxmlformats.org/drawingml/2006/wordprocessingDrawing" xmlns:w10="urn:schemas-microsoft-com:office:word" xmlns:w="http://schemas.openxmlformats.org/wordprocessingml/2006/main" xmlns:w14="http://schemas.microsoft.com/office/word/2010/wordml" xmlns:w15="http://schemas.microsoft.com/office/word/2012/wordml" xmlns:w16cex="http://schemas.microsoft.com/office/word/2018/wordml/cex" xmlns:w16cid="http://schemas.microsoft.com/office/word/2016/wordml/cid" xmlns:w16="http://schemas.microsoft.com/office/word/2018/wordml" xmlns:w16du="http://schemas.microsoft.com/office/word/2023/wordml/word16du" xmlns:w16sdtdh="http://schemas.microsoft.com/office/word/2020/wordml/sdtdatahash" xmlns:w16sdtfl="http://schemas.microsoft.com/office/word/2024/wordml/sdtformatlock" xmlns:w16se="http://schemas.microsoft.com/office/word/2015/wordml/symex" xmlns:wpg="http://schemas.microsoft.com/office/word/2010/wordprocessingGroup" xmlns:wpi="http://schemas.microsoft.com/office/word/2010/wordprocessingInk" xmlns:wne="http://schemas.microsoft.com/office/word/2006/wordml" xmlns:wps="http://schemas.microsoft.com/office/word/2010/wordprocessingShape" mc:Ignorable="w14 w15 w16se w16cid w16 w16cex w16sdtdh w16sdtfl w16du wp14">
   <w:abstractNum w:abstractNumId="0" w15:restartNumberingAfterBreak="0">
     <w:nsid w:val="FFFFFF89"/>
@@ -9731,262 +8939,7 @@
 </w:numbering>
 </file>
 
-<file path=word\settings.xml><?xml version="1.0" encoding="utf-8"?>
-<w:settings xmlns:mc="http://schemas.openxmlformats.org/markup-compatibility/2006" xmlns:o="urn:schemas-microsoft-com:office:office" xmlns:r="http://schemas.openxmlformats.org/officeDocument/2006/relationships" xmlns:m="http://schemas.openxmlformats.org/officeDocument/2006/math" xmlns:v="urn:schemas-microsoft-com:vml" xmlns:w10="urn:schemas-microsoft-com:office:word" xmlns:w="http://schemas.openxmlformats.org/wordprocessingml/2006/main" xmlns:w14="http://schemas.microsoft.com/office/word/2010/wordml" xmlns:w15="http://schemas.microsoft.com/office/word/2012/wordml" xmlns:w16cex="http://schemas.microsoft.com/office/word/2018/wordml/cex" xmlns:w16cid="http://schemas.microsoft.com/office/word/2016/wordml/cid" xmlns:w16="http://schemas.microsoft.com/office/word/2018/wordml" xmlns:w16du="http://schemas.microsoft.com/office/word/2023/wordml/word16du" xmlns:w16sdtdh="http://schemas.microsoft.com/office/word/2020/wordml/sdtdatahash" xmlns:w16sdtfl="http://schemas.microsoft.com/office/word/2024/wordml/sdtformatlock" xmlns:w16se="http://schemas.microsoft.com/office/word/2015/wordml/symex" xmlns:sl="http://schemas.openxmlformats.org/schemaLibrary/2006/main" mc:Ignorable="w14 w15 w16se w16cid w16 w16cex w16sdtdh w16sdtfl w16du">
-  <w:zoom w:percent="100"/>
-  <w:proofState w:spelling="clean" w:grammar="clean"/>
-  <w:attachedTemplate r:id="rId1"/>
-  <w:stylePaneFormatFilter w:val="5004" w:allStyles="0" w:customStyles="0" w:latentStyles="1" w:stylesInUse="0" w:headingStyles="0" w:numberingStyles="0" w:tableStyles="0" w:directFormattingOnRuns="0" w:directFormattingOnParagraphs="0" w:directFormattingOnNumbering="0" w:directFormattingOnTables="0" w:clearFormatting="1" w:top3HeadingStyles="0" w:visibleStyles="1" w:alternateStyleNames="0"/>
-  <w:stylePaneSortMethod w:val="0000"/>
-  <w:defaultTabStop w:val="720"/>
-  <w:characterSpacingControl w:val="doNotCompress"/>
-  <w:compat>
-    <w:compatSetting w:name="compatibilityMode" w:uri="http://schemas.microsoft.com/office/word" w:val="15"/>
-    <w:compatSetting w:name="overrideTableStyleFontSizeAndJustification" w:uri="http://schemas.microsoft.com/office/word" w:val="1"/>
-    <w:compatSetting w:name="enableOpenTypeFeatures" w:uri="http://schemas.microsoft.com/office/word" w:val="1"/>
-    <w:compatSetting w:name="doNotFlipMirrorIndents" w:uri="http://schemas.microsoft.com/office/word" w:val="1"/>
-    <w:compatSetting w:name="differentiateMultirowTableHeaders" w:uri="http://schemas.microsoft.com/office/word" w:val="1"/>
-    <w:compatSetting w:name="useWord2013TrackBottomHyphenation" w:uri="http://schemas.microsoft.com/office/word" w:val="0"/>
-  </w:compat>
-  <w:rsids>
-    <w:rsidRoot w:val="00685DCE"/>
-    <w:rsid w:val="000015E7"/>
-    <w:rsid w:val="00013B41"/>
-    <w:rsid w:val="000429E8"/>
-    <w:rsid w:val="00046B5F"/>
-    <w:rsid w:val="0005061E"/>
-    <w:rsid w:val="000543D2"/>
-    <w:rsid w:val="0008190F"/>
-    <w:rsid w:val="000942D0"/>
-    <w:rsid w:val="000C1DBA"/>
-    <w:rsid w:val="000C411E"/>
-    <w:rsid w:val="000E6F71"/>
-    <w:rsid w:val="000F3CD7"/>
-    <w:rsid w:val="000F7EBE"/>
-    <w:rsid w:val="00100B74"/>
-    <w:rsid w:val="001058BE"/>
-    <w:rsid w:val="00137470"/>
-    <w:rsid w:val="00137B9B"/>
-    <w:rsid w:val="00151855"/>
-    <w:rsid w:val="00185E89"/>
-    <w:rsid w:val="00196147"/>
-    <w:rsid w:val="001B4886"/>
-    <w:rsid w:val="001C2457"/>
-    <w:rsid w:val="001C7009"/>
-    <w:rsid w:val="001E2BAB"/>
-    <w:rsid w:val="001E41FC"/>
-    <w:rsid w:val="001E5690"/>
-    <w:rsid w:val="0021154B"/>
-    <w:rsid w:val="00231652"/>
-    <w:rsid w:val="002374AE"/>
-    <w:rsid w:val="00257458"/>
-    <w:rsid w:val="0026074D"/>
-    <w:rsid w:val="002644D4"/>
-    <w:rsid w:val="00285F35"/>
-    <w:rsid w:val="002A55AD"/>
-    <w:rsid w:val="002C3D70"/>
-    <w:rsid w:val="002C7C29"/>
-    <w:rsid w:val="002D7394"/>
-    <w:rsid w:val="002F240C"/>
-    <w:rsid w:val="0032226E"/>
-    <w:rsid w:val="0036014C"/>
-    <w:rsid w:val="00375D6F"/>
-    <w:rsid w:val="00383350"/>
-    <w:rsid w:val="003A0A68"/>
-    <w:rsid w:val="003E0FB4"/>
-    <w:rsid w:val="00400B88"/>
-    <w:rsid w:val="00406E7F"/>
-    <w:rsid w:val="00411302"/>
-    <w:rsid w:val="00416CAD"/>
-    <w:rsid w:val="00417329"/>
-    <w:rsid w:val="0042158C"/>
-    <w:rsid w:val="004261DC"/>
-    <w:rsid w:val="0042625C"/>
-    <w:rsid w:val="00444F90"/>
-    <w:rsid w:val="004455C8"/>
-    <w:rsid w:val="004507EA"/>
-    <w:rsid w:val="00451976"/>
-    <w:rsid w:val="00453D74"/>
-    <w:rsid w:val="00454052"/>
-    <w:rsid w:val="0046288F"/>
-    <w:rsid w:val="00475B42"/>
-    <w:rsid w:val="004809FF"/>
-    <w:rsid w:val="004959B0"/>
-    <w:rsid w:val="004A603C"/>
-    <w:rsid w:val="004B79F8"/>
-    <w:rsid w:val="004F1B78"/>
-    <w:rsid w:val="00502E51"/>
-    <w:rsid w:val="005202CA"/>
-    <w:rsid w:val="00576D30"/>
-    <w:rsid w:val="005933EA"/>
-    <w:rsid w:val="005C242D"/>
-    <w:rsid w:val="005C5706"/>
-    <w:rsid w:val="005E5CA3"/>
-    <w:rsid w:val="00614F16"/>
-    <w:rsid w:val="0062799C"/>
-    <w:rsid w:val="00631314"/>
-    <w:rsid w:val="00637F90"/>
-    <w:rsid w:val="006404EC"/>
-    <w:rsid w:val="00640C40"/>
-    <w:rsid w:val="00645ACA"/>
-    <w:rsid w:val="0066025D"/>
-    <w:rsid w:val="00663E12"/>
-    <w:rsid w:val="00671CB2"/>
-    <w:rsid w:val="0068408C"/>
-    <w:rsid w:val="00685076"/>
-    <w:rsid w:val="00685DCE"/>
-    <w:rsid w:val="00687E22"/>
-    <w:rsid w:val="00692CEC"/>
-    <w:rsid w:val="006F609F"/>
-    <w:rsid w:val="00700D95"/>
-    <w:rsid w:val="00714F9A"/>
-    <w:rsid w:val="00720156"/>
-    <w:rsid w:val="00722B5F"/>
-    <w:rsid w:val="0073059E"/>
-    <w:rsid w:val="00733701"/>
-    <w:rsid w:val="00754C11"/>
-    <w:rsid w:val="00776279"/>
-    <w:rsid w:val="00793821"/>
-    <w:rsid w:val="007A6E81"/>
-    <w:rsid w:val="007C06D7"/>
-    <w:rsid w:val="007E112A"/>
-    <w:rsid w:val="0080594C"/>
-    <w:rsid w:val="008112C7"/>
-    <w:rsid w:val="00820105"/>
-    <w:rsid w:val="008350DD"/>
-    <w:rsid w:val="00837C45"/>
-    <w:rsid w:val="00847619"/>
-    <w:rsid w:val="00850034"/>
-    <w:rsid w:val="00851932"/>
-    <w:rsid w:val="00862B65"/>
-    <w:rsid w:val="00864853"/>
-    <w:rsid w:val="00872C1A"/>
-    <w:rsid w:val="00882C99"/>
-    <w:rsid w:val="008963A4"/>
-    <w:rsid w:val="008B139B"/>
-    <w:rsid w:val="008B40B4"/>
-    <w:rsid w:val="008C57C3"/>
-    <w:rsid w:val="008D738D"/>
-    <w:rsid w:val="008E16DC"/>
-    <w:rsid w:val="008F5025"/>
-    <w:rsid w:val="008F54D0"/>
-    <w:rsid w:val="00930B81"/>
-    <w:rsid w:val="00937B53"/>
-    <w:rsid w:val="00944C7F"/>
-    <w:rsid w:val="0095168F"/>
-    <w:rsid w:val="00961DFD"/>
-    <w:rsid w:val="009A3C4B"/>
-    <w:rsid w:val="009B5E94"/>
-    <w:rsid w:val="009C05D1"/>
-    <w:rsid w:val="009C6121"/>
-    <w:rsid w:val="009D68F5"/>
-    <w:rsid w:val="009E1FE6"/>
-    <w:rsid w:val="00A15469"/>
-    <w:rsid w:val="00A172A7"/>
-    <w:rsid w:val="00A719B0"/>
-    <w:rsid w:val="00A80FB5"/>
-    <w:rsid w:val="00A8582A"/>
-    <w:rsid w:val="00AA077D"/>
-    <w:rsid w:val="00AE06F1"/>
-    <w:rsid w:val="00AF7CA2"/>
-    <w:rsid w:val="00B10275"/>
-    <w:rsid w:val="00B15D96"/>
-    <w:rsid w:val="00B23EBB"/>
-    <w:rsid w:val="00B565E8"/>
-    <w:rsid w:val="00B64CAA"/>
-    <w:rsid w:val="00B77DE8"/>
-    <w:rsid w:val="00B817AB"/>
-    <w:rsid w:val="00B81D38"/>
-    <w:rsid w:val="00B83FE8"/>
-    <w:rsid w:val="00B97DB1"/>
-    <w:rsid w:val="00BA062E"/>
-    <w:rsid w:val="00BB06B2"/>
-    <w:rsid w:val="00BC32F1"/>
-    <w:rsid w:val="00BD5323"/>
-    <w:rsid w:val="00C0042C"/>
-    <w:rsid w:val="00C03558"/>
-    <w:rsid w:val="00C1461A"/>
-    <w:rsid w:val="00C64947"/>
-    <w:rsid w:val="00C649E5"/>
-    <w:rsid w:val="00C70E81"/>
-    <w:rsid w:val="00C8491A"/>
-    <w:rsid w:val="00CA0922"/>
-    <w:rsid w:val="00CA3046"/>
-    <w:rsid w:val="00CB2524"/>
-    <w:rsid w:val="00CC1C16"/>
-    <w:rsid w:val="00CC3681"/>
-    <w:rsid w:val="00CC42B0"/>
-    <w:rsid w:val="00CE342F"/>
-    <w:rsid w:val="00CF1D3D"/>
-    <w:rsid w:val="00CF7D78"/>
-    <w:rsid w:val="00CF7F25"/>
-    <w:rsid w:val="00D07BC6"/>
-    <w:rsid w:val="00D408AC"/>
-    <w:rsid w:val="00D4324E"/>
-    <w:rsid w:val="00D543DA"/>
-    <w:rsid w:val="00D55A5C"/>
-    <w:rsid w:val="00D77AE6"/>
-    <w:rsid w:val="00D80AA3"/>
-    <w:rsid w:val="00D920AB"/>
-    <w:rsid w:val="00DA3717"/>
-    <w:rsid w:val="00DC50ED"/>
-    <w:rsid w:val="00DD4FC1"/>
-    <w:rsid w:val="00E12E68"/>
-    <w:rsid w:val="00E14BF0"/>
-    <w:rsid w:val="00E41601"/>
-    <w:rsid w:val="00E67DB7"/>
-    <w:rsid w:val="00E724A0"/>
-    <w:rsid w:val="00EB40FD"/>
-    <w:rsid w:val="00EB7B9D"/>
-    <w:rsid w:val="00EC5D3E"/>
-    <w:rsid w:val="00EE22B8"/>
-    <w:rsid w:val="00EE325F"/>
-    <w:rsid w:val="00F100AF"/>
-    <w:rsid w:val="00F16E9A"/>
-    <w:rsid w:val="00F1738C"/>
-    <w:rsid w:val="00F26C67"/>
-    <w:rsid w:val="00F32271"/>
-    <w:rsid w:val="00F35397"/>
-    <w:rsid w:val="00F4689E"/>
-    <w:rsid w:val="00F54E98"/>
-    <w:rsid w:val="00FA2024"/>
-    <w:rsid w:val="00FB1D65"/>
-    <w:rsid w:val="00FB47A9"/>
-    <w:rsid w:val="00FB6A07"/>
-    <w:rsid w:val="00FD11F7"/>
-    <w:rsid w:val="00FE2F25"/>
-    <w:rsid w:val="00FF6696"/>
-  </w:rsids>
-  <m:mathPr>
-    <m:mathFont m:val="Cambria Math"/>
-    <m:brkBin m:val="before"/>
-    <m:brkBinSub m:val="--"/>
-    <m:smallFrac m:val="0"/>
-    <m:dispDef/>
-    <m:lMargin m:val="0"/>
-    <m:rMargin m:val="0"/>
-    <m:defJc m:val="centerGroup"/>
-    <m:wrapIndent m:val="1440"/>
-    <m:intLim m:val="subSup"/>
-    <m:naryLim m:val="undOvr"/>
-  </m:mathPr>
-  <w:themeFontLang w:val="en-IN"/>
-  <w:clrSchemeMapping w:bg1="light1" w:t1="dark1" w:bg2="light2" w:t2="dark2" w:accent1="accent1" w:accent2="accent2" w:accent3="accent3" w:accent4="accent4" w:accent5="accent5" w:accent6="accent6" w:hyperlink="hyperlink" w:followedHyperlink="followedHyperlink"/>
-  <w:shapeDefaults>
-    <o:shapedefaults v:ext="edit" spidmax="1026"/>
-    <o:shapelayout v:ext="edit">
-      <o:idmap v:ext="edit" data="1"/>
-    </o:shapelayout>
-  </w:shapeDefaults>
-  <w:decimalSymbol w:val="."/>
-  <w:listSeparator w:val=","/>
-  <w14:docId w14:val="4ED0E2FB"/>
-  <w15:chartTrackingRefBased/>
-  <w15:docId w15:val="{9300225A-8324-45CF-B024-684D31FAD4B2}"/>
-</w:settings>
-</file>
-
-<file path=word\styles.xml><?xml version="1.0" encoding="utf-8"?>
+<file path=word/styles.xml><?xml version="1.0" encoding="utf-8"?>
 <w:styles xmlns:mc="http://schemas.openxmlformats.org/markup-compatibility/2006" xmlns:r="http://schemas.openxmlformats.org/officeDocument/2006/relationships" xmlns:w="http://schemas.openxmlformats.org/wordprocessingml/2006/main" xmlns:w14="http://schemas.microsoft.com/office/word/2010/wordml" xmlns:w15="http://schemas.microsoft.com/office/word/2012/wordml" xmlns:w16cex="http://schemas.microsoft.com/office/word/2018/wordml/cex" xmlns:w16cid="http://schemas.microsoft.com/office/word/2016/wordml/cid" xmlns:w16="http://schemas.microsoft.com/office/word/2018/wordml" xmlns:w16du="http://schemas.microsoft.com/office/word/2023/wordml/word16du" xmlns:w16sdtdh="http://schemas.microsoft.com/office/word/2020/wordml/sdtdatahash" xmlns:w16sdtfl="http://schemas.microsoft.com/office/word/2024/wordml/sdtformatlock" xmlns:w16se="http://schemas.microsoft.com/office/word/2015/wordml/symex" mc:Ignorable="w14 w15 w16se w16cid w16 w16cex w16sdtdh w16sdtfl w16du">
   <w:docDefaults>
     <w:rPrDefault>
@@ -10745,7 +9698,7 @@
 </w:styles>
 </file>
 
-<file path=word\theme\theme1.xml><?xml version="1.0" encoding="utf-8"?>
+<file path=word/theme/theme1.xml><?xml version="1.0" encoding="utf-8"?>
 <a:theme xmlns:a="http://schemas.openxmlformats.org/drawingml/2006/main" name="Office Theme">
   <a:themeElements>
     <a:clrScheme name="4201619">
@@ -10946,10 +9899,416 @@
 </a:theme>
 </file>
 
-<file path=word\webSettings.xml><?xml version="1.0" encoding="utf-8"?>
-<w:webSettings xmlns:mc="http://schemas.openxmlformats.org/markup-compatibility/2006" xmlns:r="http://schemas.openxmlformats.org/officeDocument/2006/relationships" xmlns:w="http://schemas.openxmlformats.org/wordprocessingml/2006/main" xmlns:w14="http://schemas.microsoft.com/office/word/2010/wordml" xmlns:w15="http://schemas.microsoft.com/office/word/2012/wordml" xmlns:w16cex="http://schemas.microsoft.com/office/word/2018/wordml/cex" xmlns:w16cid="http://schemas.microsoft.com/office/word/2016/wordml/cid" xmlns:w16="http://schemas.microsoft.com/office/word/2018/wordml" xmlns:w16du="http://schemas.microsoft.com/office/word/2023/wordml/word16du" xmlns:w16sdtdh="http://schemas.microsoft.com/office/word/2020/wordml/sdtdatahash" xmlns:w16sdtfl="http://schemas.microsoft.com/office/word/2024/wordml/sdtformatlock" xmlns:w16se="http://schemas.microsoft.com/office/word/2015/wordml/symex" mc:Ignorable="w14 w15 w16se w16cid w16 w16cex w16sdtdh w16sdtfl w16du">
-  <w:optimizeForBrowser/>
-  <w:relyOnVML/>
-  <w:allowPNG/>
-</w:webSettings>
+<file path=customXml/item1.xml><?xml version="1.0" encoding="utf-8"?>
+<p:properties xmlns:p="http://schemas.microsoft.com/office/2006/metadata/properties" xmlns:xsi="http://www.w3.org/2001/XMLSchema-instance" xmlns:pc="http://schemas.microsoft.com/office/infopath/2007/PartnerControls">
+  <documentManagement>
+    <_ip_UnifiedCompliancePolicyUIAction xmlns="http://schemas.microsoft.com/sharepoint/v3" xsi:nil="true"/>
+    <_ip_UnifiedCompliancePolicyProperties xmlns="http://schemas.microsoft.com/sharepoint/v3" xsi:nil="true"/>
+    <TaxCatchAll xmlns="230e9df3-be65-4c73-a93b-d1236ebd677e" xsi:nil="true"/>
+    <ImageTagsTaxHTField xmlns="71af3243-3dd4-4a8d-8c0d-dd76da1f02a5">
+      <Terms xmlns="http://schemas.microsoft.com/office/infopath/2007/PartnerControls"/>
+    </ImageTagsTaxHTField>
+    <Image xmlns="71af3243-3dd4-4a8d-8c0d-dd76da1f02a5">
+      <Url xsi:nil="true"/>
+      <Description xsi:nil="true"/>
+    </Image>
+    <Status xmlns="71af3243-3dd4-4a8d-8c0d-dd76da1f02a5">Not started</Status>
+    <Background xmlns="71af3243-3dd4-4a8d-8c0d-dd76da1f02a5">false</Background>
+    <MediaServiceKeyPoints xmlns="71af3243-3dd4-4a8d-8c0d-dd76da1f02a5" xsi:nil="true"/>
+    <SharedWithUsers xmlns="16c05727-aa75-4e4a-9b5f-8a80a1165891">
+      <UserInfo>
+        <DisplayName/>
+        <AccountId xsi:nil="true"/>
+        <AccountType/>
+      </UserInfo>
+    </SharedWithUsers>
+  </documentManagement>
+</p:properties>
+</file>
+
+<file path=customXml/item2.xml><?xml version="1.0" encoding="utf-8"?>
+<?mso-contentType ?>
+<FormTemplates xmlns="http://schemas.microsoft.com/sharepoint/v3/contenttype/forms">
+  <Display>DocumentLibraryForm</Display>
+  <Edit>DocumentLibraryForm</Edit>
+  <New>DocumentLibraryForm</New>
+</FormTemplates>
+</file>
+
+<file path=customXml/item3.xml><?xml version="1.0" encoding="utf-8"?>
+<ct:contentTypeSchema xmlns:ct="http://schemas.microsoft.com/office/2006/metadata/contentType" xmlns:ma="http://schemas.microsoft.com/office/2006/metadata/properties/metaAttributes" ct:_="" ma:_="" ma:contentTypeName="Document" ma:contentTypeID="0x01010079F111ED35F8CC479449609E8A0923A6" ma:contentTypeVersion="30" ma:contentTypeDescription="Create a new document." ma:contentTypeScope="" ma:versionID="cec0622158e8f13124e9e8fd4de31bd1">
+  <xsd:schema xmlns:xsd="http://www.w3.org/2001/XMLSchema" xmlns:xs="http://www.w3.org/2001/XMLSchema" xmlns:p="http://schemas.microsoft.com/office/2006/metadata/properties" xmlns:ns1="http://schemas.microsoft.com/sharepoint/v3" xmlns:ns2="71af3243-3dd4-4a8d-8c0d-dd76da1f02a5" xmlns:ns3="16c05727-aa75-4e4a-9b5f-8a80a1165891" xmlns:ns4="230e9df3-be65-4c73-a93b-d1236ebd677e" targetNamespace="http://schemas.microsoft.com/office/2006/metadata/properties" ma:root="true" ma:fieldsID="3b52f30ab005d15df08657af532e6e38" ns1:_="" ns2:_="" ns3:_="" ns4:_="">
+    <xsd:import namespace="http://schemas.microsoft.com/sharepoint/v3"/>
+    <xsd:import namespace="71af3243-3dd4-4a8d-8c0d-dd76da1f02a5"/>
+    <xsd:import namespace="16c05727-aa75-4e4a-9b5f-8a80a1165891"/>
+    <xsd:import namespace="230e9df3-be65-4c73-a93b-d1236ebd677e"/>
+    <xsd:element name="properties">
+      <xsd:complexType>
+        <xsd:sequence>
+          <xsd:element name="documentManagement">
+            <xsd:complexType>
+              <xsd:all>
+                <xsd:element ref="ns2:Status" minOccurs="0"/>
+                <xsd:element ref="ns2:Image" minOccurs="0"/>
+                <xsd:element ref="ns2:MediaServiceMetadata" minOccurs="0"/>
+                <xsd:element ref="ns2:MediaServiceFastMetadata" minOccurs="0"/>
+                <xsd:element ref="ns2:MediaServiceOCR" minOccurs="0"/>
+                <xsd:element ref="ns2:MediaServiceAutoTags" minOccurs="0"/>
+                <xsd:element ref="ns2:MediaServiceEventHashCode" minOccurs="0"/>
+                <xsd:element ref="ns2:MediaServiceGenerationTime" minOccurs="0"/>
+                <xsd:element ref="ns3:SharedWithUsers" minOccurs="0"/>
+                <xsd:element ref="ns3:SharedWithDetails" minOccurs="0"/>
+                <xsd:element ref="ns2:MediaServiceAutoKeyPoints" minOccurs="0"/>
+                <xsd:element ref="ns2:MediaServiceKeyPoints" minOccurs="0"/>
+                <xsd:element ref="ns2:MediaServiceDateTaken" minOccurs="0"/>
+                <xsd:element ref="ns1:_ip_UnifiedCompliancePolicyProperties" minOccurs="0"/>
+                <xsd:element ref="ns1:_ip_UnifiedCompliancePolicyUIAction" minOccurs="0"/>
+                <xsd:element ref="ns4:TaxCatchAll" minOccurs="0"/>
+                <xsd:element ref="ns2:ImageTagsTaxHTField" minOccurs="0"/>
+                <xsd:element ref="ns2:MediaServiceLocation" minOccurs="0"/>
+                <xsd:element ref="ns2:MediaLengthInSeconds" minOccurs="0"/>
+                <xsd:element ref="ns2:Background" minOccurs="0"/>
+                <xsd:element ref="ns2:MediaServiceSearchProperties" minOccurs="0"/>
+                <xsd:element ref="ns2:MediaServiceDocTags" minOccurs="0"/>
+                <xsd:element ref="ns2:MediaServiceObjectDetectorVersions" minOccurs="0"/>
+                <xsd:element ref="ns2:MediaServiceSystemTags" minOccurs="0"/>
+                <xsd:element ref="ns2:MediaServiceBillingMetadata" minOccurs="0"/>
+              </xsd:all>
+            </xsd:complexType>
+          </xsd:element>
+        </xsd:sequence>
+      </xsd:complexType>
+    </xsd:element>
+  </xsd:schema>
+  <xsd:schema xmlns:xsd="http://www.w3.org/2001/XMLSchema" xmlns:xs="http://www.w3.org/2001/XMLSchema" xmlns:dms="http://schemas.microsoft.com/office/2006/documentManagement/types" xmlns:pc="http://schemas.microsoft.com/office/infopath/2007/PartnerControls" targetNamespace="http://schemas.microsoft.com/sharepoint/v3" elementFormDefault="qualified">
+    <xsd:import namespace="http://schemas.microsoft.com/office/2006/documentManagement/types"/>
+    <xsd:import namespace="http://schemas.microsoft.com/office/infopath/2007/PartnerControls"/>
+    <xsd:element name="_ip_UnifiedCompliancePolicyProperties" ma:index="20" nillable="true" ma:displayName="Unified Compliance Policy Properties" ma:hidden="true" ma:internalName="_ip_UnifiedCompliancePolicyProperties" ma:readOnly="false">
+      <xsd:simpleType>
+        <xsd:restriction base="dms:Note"/>
+      </xsd:simpleType>
+    </xsd:element>
+    <xsd:element name="_ip_UnifiedCompliancePolicyUIAction" ma:index="21" nillable="true" ma:displayName="Unified Compliance Policy UI Action" ma:hidden="true" ma:internalName="_ip_UnifiedCompliancePolicyUIAction" ma:readOnly="false">
+      <xsd:simpleType>
+        <xsd:restriction base="dms:Text"/>
+      </xsd:simpleType>
+    </xsd:element>
+  </xsd:schema>
+  <xsd:schema xmlns:xsd="http://www.w3.org/2001/XMLSchema" xmlns:xs="http://www.w3.org/2001/XMLSchema" xmlns:dms="http://schemas.microsoft.com/office/2006/documentManagement/types" xmlns:pc="http://schemas.microsoft.com/office/infopath/2007/PartnerControls" targetNamespace="71af3243-3dd4-4a8d-8c0d-dd76da1f02a5" elementFormDefault="qualified">
+    <xsd:import namespace="http://schemas.microsoft.com/office/2006/documentManagement/types"/>
+    <xsd:import namespace="http://schemas.microsoft.com/office/infopath/2007/PartnerControls"/>
+    <xsd:element name="Status" ma:index="2" nillable="true" ma:displayName="Status" ma:default="Not started" ma:format="Dropdown" ma:hidden="true" ma:internalName="Status" ma:readOnly="false">
+      <xsd:simpleType>
+        <xsd:restriction base="dms:Choice">
+          <xsd:enumeration value="Not started"/>
+          <xsd:enumeration value="In Progress"/>
+          <xsd:enumeration value="Completed"/>
+        </xsd:restriction>
+      </xsd:simpleType>
+    </xsd:element>
+    <xsd:element name="Image" ma:index="3" nillable="true" ma:displayName="Image" ma:format="Image" ma:hidden="true" ma:internalName="Image" ma:readOnly="false">
+      <xsd:complexType>
+        <xsd:complexContent>
+          <xsd:extension base="dms:URL">
+            <xsd:sequence>
+              <xsd:element name="Url" type="dms:ValidUrl" minOccurs="0" nillable="true"/>
+              <xsd:element name="Description" type="xsd:string" nillable="true"/>
+            </xsd:sequence>
+          </xsd:extension>
+        </xsd:complexContent>
+      </xsd:complexType>
+    </xsd:element>
+    <xsd:element name="MediaServiceMetadata" ma:index="8" nillable="true" ma:displayName="MediaServiceMetadata" ma:hidden="true" ma:internalName="MediaServiceMetadata" ma:readOnly="true">
+      <xsd:simpleType>
+        <xsd:restriction base="dms:Note"/>
+      </xsd:simpleType>
+    </xsd:element>
+    <xsd:element name="MediaServiceFastMetadata" ma:index="9" nillable="true" ma:displayName="MediaServiceFastMetadata" ma:hidden="true" ma:internalName="MediaServiceFastMetadata" ma:readOnly="true">
+      <xsd:simpleType>
+        <xsd:restriction base="dms:Note"/>
+      </xsd:simpleType>
+    </xsd:element>
+    <xsd:element name="MediaServiceOCR" ma:index="10" nillable="true" ma:displayName="MediaServiceOCR" ma:hidden="true" ma:internalName="MediaServiceOCR" ma:readOnly="true">
+      <xsd:simpleType>
+        <xsd:restriction base="dms:Note"/>
+      </xsd:simpleType>
+    </xsd:element>
+    <xsd:element name="MediaServiceAutoTags" ma:index="11" nillable="true" ma:displayName="MediaServiceAutoTags" ma:hidden="true" ma:internalName="MediaServiceAutoTags" ma:readOnly="true">
+      <xsd:simpleType>
+        <xsd:restriction base="dms:Text"/>
+      </xsd:simpleType>
+    </xsd:element>
+    <xsd:element name="MediaServiceEventHashCode" ma:index="12" nillable="true" ma:displayName="MediaServiceEventHashCode" ma:hidden="true" ma:internalName="MediaServiceEventHashCode" ma:readOnly="true">
+      <xsd:simpleType>
+        <xsd:restriction base="dms:Text"/>
+      </xsd:simpleType>
+    </xsd:element>
+    <xsd:element name="MediaServiceGenerationTime" ma:index="13" nillable="true" ma:displayName="MediaServiceGenerationTime" ma:hidden="true" ma:internalName="MediaServiceGenerationTime" ma:readOnly="true">
+      <xsd:simpleType>
+        <xsd:restriction base="dms:Text"/>
+      </xsd:simpleType>
+    </xsd:element>
+    <xsd:element name="MediaServiceAutoKeyPoints" ma:index="16" nillable="true" ma:displayName="MediaServiceAutoKeyPoints" ma:hidden="true" ma:internalName="MediaServiceAutoKeyPoints" ma:readOnly="true">
+      <xsd:simpleType>
+        <xsd:restriction base="dms:Note"/>
+      </xsd:simpleType>
+    </xsd:element>
+    <xsd:element name="MediaServiceKeyPoints" ma:index="17" nillable="true" ma:displayName="KeyPoints" ma:hidden="true" ma:internalName="MediaServiceKeyPoints" ma:readOnly="false">
+      <xsd:simpleType>
+        <xsd:restriction base="dms:Note"/>
+      </xsd:simpleType>
+    </xsd:element>
+    <xsd:element name="MediaServiceDateTaken" ma:index="18" nillable="true" ma:displayName="MediaServiceDateTaken" ma:hidden="true" ma:internalName="MediaServiceDateTaken" ma:readOnly="true">
+      <xsd:simpleType>
+        <xsd:restriction base="dms:Text"/>
+      </xsd:simpleType>
+    </xsd:element>
+    <xsd:element name="ImageTagsTaxHTField" ma:index="25" nillable="true" ma:taxonomy="true" ma:internalName="ImageTagsTaxHTField" ma:taxonomyFieldName="MediaServiceImageTags" ma:displayName="Image Tags" ma:readOnly="false" ma:fieldId="{5cf76f15-5ced-4ddc-b409-7134ff3c332f}" ma:taxonomyMulti="true" ma:sspId="e385fb40-52d4-4fae-9c5b-3e8ff8a5878e" ma:termSetId="09814cd3-568e-fe90-9814-8d621ff8fb84" ma:anchorId="fba54fb3-c3e1-fe81-a776-ca4b69148c4d" ma:open="true" ma:isKeyword="false">
+      <xsd:complexType>
+        <xsd:sequence>
+          <xsd:element ref="pc:Terms" minOccurs="0" maxOccurs="1"/>
+        </xsd:sequence>
+      </xsd:complexType>
+    </xsd:element>
+    <xsd:element name="MediaServiceLocation" ma:index="26" nillable="true" ma:displayName="Location" ma:hidden="true" ma:internalName="MediaServiceLocation" ma:readOnly="true">
+      <xsd:simpleType>
+        <xsd:restriction base="dms:Text"/>
+      </xsd:simpleType>
+    </xsd:element>
+    <xsd:element name="MediaLengthInSeconds" ma:index="27" nillable="true" ma:displayName="MediaLengthInSeconds" ma:hidden="true" ma:internalName="MediaLengthInSeconds" ma:readOnly="true">
+      <xsd:simpleType>
+        <xsd:restriction base="dms:Unknown"/>
+      </xsd:simpleType>
+    </xsd:element>
+    <xsd:element name="Background" ma:index="28" nillable="true" ma:displayName="Background" ma:default="0" ma:format="Dropdown" ma:hidden="true" ma:internalName="Background" ma:readOnly="false">
+      <xsd:simpleType>
+        <xsd:restriction base="dms:Boolean"/>
+      </xsd:simpleType>
+    </xsd:element>
+    <xsd:element name="MediaServiceSearchProperties" ma:index="29" nillable="true" ma:displayName="MediaServiceSearchProperties" ma:hidden="true" ma:internalName="MediaServiceSearchProperties" ma:readOnly="true">
+      <xsd:simpleType>
+        <xsd:restriction base="dms:Note"/>
+      </xsd:simpleType>
+    </xsd:element>
+    <xsd:element name="MediaServiceDocTags" ma:index="30" nillable="true" ma:displayName="MediaServiceDocTags" ma:hidden="true" ma:internalName="MediaServiceDocTags" ma:readOnly="true">
+      <xsd:simpleType>
+        <xsd:restriction base="dms:Note"/>
+      </xsd:simpleType>
+    </xsd:element>
+    <xsd:element name="MediaServiceObjectDetectorVersions" ma:index="31" nillable="true" ma:displayName="MediaServiceObjectDetectorVersions" ma:description="" ma:hidden="true" ma:indexed="true" ma:internalName="MediaServiceObjectDetectorVersions" ma:readOnly="true">
+      <xsd:simpleType>
+        <xsd:restriction base="dms:Text"/>
+      </xsd:simpleType>
+    </xsd:element>
+    <xsd:element name="MediaServiceSystemTags" ma:index="32" nillable="true" ma:displayName="MediaServiceSystemTags" ma:hidden="true" ma:internalName="MediaServiceSystemTags" ma:readOnly="true">
+      <xsd:simpleType>
+        <xsd:restriction base="dms:Note"/>
+      </xsd:simpleType>
+    </xsd:element>
+    <xsd:element name="MediaServiceBillingMetadata" ma:index="33" nillable="true" ma:displayName="MediaServiceBillingMetadata" ma:hidden="true" ma:internalName="MediaServiceBillingMetadata" ma:readOnly="true">
+      <xsd:simpleType>
+        <xsd:restriction base="dms:Text"/>
+      </xsd:simpleType>
+    </xsd:element>
+  </xsd:schema>
+  <xsd:schema xmlns:xsd="http://www.w3.org/2001/XMLSchema" xmlns:xs="http://www.w3.org/2001/XMLSchema" xmlns:dms="http://schemas.microsoft.com/office/2006/documentManagement/types" xmlns:pc="http://schemas.microsoft.com/office/infopath/2007/PartnerControls" targetNamespace="16c05727-aa75-4e4a-9b5f-8a80a1165891" elementFormDefault="qualified">
+    <xsd:import namespace="http://schemas.microsoft.com/office/2006/documentManagement/types"/>
+    <xsd:import namespace="http://schemas.microsoft.com/office/infopath/2007/PartnerControls"/>
+    <xsd:element name="SharedWithUsers" ma:index="14" nillable="true" ma:displayName="Shared With" ma:hidden="true" ma:internalName="SharedWithUsers" ma:readOnly="true">
+      <xsd:complexType>
+        <xsd:complexContent>
+          <xsd:extension base="dms:UserMulti">
+            <xsd:sequence>
+              <xsd:element name="UserInfo" minOccurs="0" maxOccurs="unbounded">
+                <xsd:complexType>
+                  <xsd:sequence>
+                    <xsd:element name="DisplayName" type="xsd:string" minOccurs="0"/>
+                    <xsd:element name="AccountId" type="dms:UserId" minOccurs="0" nillable="true"/>
+                    <xsd:element name="AccountType" type="xsd:string" minOccurs="0"/>
+                  </xsd:sequence>
+                </xsd:complexType>
+              </xsd:element>
+            </xsd:sequence>
+          </xsd:extension>
+        </xsd:complexContent>
+      </xsd:complexType>
+    </xsd:element>
+    <xsd:element name="SharedWithDetails" ma:index="15" nillable="true" ma:displayName="Shared With Details" ma:hidden="true" ma:internalName="SharedWithDetails" ma:readOnly="true">
+      <xsd:simpleType>
+        <xsd:restriction base="dms:Note"/>
+      </xsd:simpleType>
+    </xsd:element>
+  </xsd:schema>
+  <xsd:schema xmlns:xsd="http://www.w3.org/2001/XMLSchema" xmlns:xs="http://www.w3.org/2001/XMLSchema" xmlns:dms="http://schemas.microsoft.com/office/2006/documentManagement/types" xmlns:pc="http://schemas.microsoft.com/office/infopath/2007/PartnerControls" targetNamespace="230e9df3-be65-4c73-a93b-d1236ebd677e" elementFormDefault="qualified">
+    <xsd:import namespace="http://schemas.microsoft.com/office/2006/documentManagement/types"/>
+    <xsd:import namespace="http://schemas.microsoft.com/office/infopath/2007/PartnerControls"/>
+    <xsd:element name="TaxCatchAll" ma:index="23" nillable="true" ma:displayName="Taxonomy Catch All Column" ma:hidden="true" ma:list="{3f6bfcbc-3db3-4ae6-bd76-326f0798ad28}" ma:internalName="TaxCatchAll" ma:readOnly="false" ma:showField="CatchAllData" ma:web="16c05727-aa75-4e4a-9b5f-8a80a1165891">
+      <xsd:complexType>
+        <xsd:complexContent>
+          <xsd:extension base="dms:MultiChoiceLookup">
+            <xsd:sequence>
+              <xsd:element name="Value" type="dms:Lookup" maxOccurs="unbounded" minOccurs="0" nillable="true"/>
+            </xsd:sequence>
+          </xsd:extension>
+        </xsd:complexContent>
+      </xsd:complexType>
+    </xsd:element>
+  </xsd:schema>
+  <xsd:schema xmlns="http://schemas.openxmlformats.org/package/2006/metadata/core-properties" xmlns:xsd="http://www.w3.org/2001/XMLSchema" xmlns:xsi="http://www.w3.org/2001/XMLSchema-instance" xmlns:dc="http://purl.org/dc/elements/1.1/" xmlns:dcterms="http://purl.org/dc/terms/" xmlns:odoc="http://schemas.microsoft.com/internal/obd" targetNamespace="http://schemas.openxmlformats.org/package/2006/metadata/core-properties" elementFormDefault="qualified" attributeFormDefault="unqualified" blockDefault="#all">
+    <xsd:import namespace="http://purl.org/dc/elements/1.1/" schemaLocation="http://dublincore.org/schemas/xmls/qdc/2003/04/02/dc.xsd"/>
+    <xsd:import namespace="http://purl.org/dc/terms/" schemaLocation="http://dublincore.org/schemas/xmls/qdc/2003/04/02/dcterms.xsd"/>
+    <xsd:element name="coreProperties" type="CT_coreProperties"/>
+    <xsd:complexType name="CT_coreProperties">
+      <xsd:all>
+        <xsd:element ref="dc:creator" minOccurs="0" maxOccurs="1"/>
+        <xsd:element ref="dcterms:created" minOccurs="0" maxOccurs="1"/>
+        <xsd:element ref="dc:identifier" minOccurs="0" maxOccurs="1"/>
+        <xsd:element name="contentType" minOccurs="0" maxOccurs="1" type="xsd:string" ma:displayName="Content Type"/>
+        <xsd:element ref="dc:title" minOccurs="0" maxOccurs="1" ma:index="1" ma:displayName="Title"/>
+        <xsd:element ref="dc:subject" minOccurs="0" maxOccurs="1"/>
+        <xsd:element ref="dc:description" minOccurs="0" maxOccurs="1"/>
+        <xsd:element name="keywords" minOccurs="0" maxOccurs="1" type="xsd:string"/>
+        <xsd:element ref="dc:language" minOccurs="0" maxOccurs="1"/>
+        <xsd:element name="category" minOccurs="0" maxOccurs="1" type="xsd:string"/>
+        <xsd:element name="version" minOccurs="0" maxOccurs="1" type="xsd:string"/>
+        <xsd:element name="revision" minOccurs="0" maxOccurs="1" type="xsd:string">
+          <xsd:annotation>
+            <xsd:documentation>
+                        This value indicates the number of saves or revisions. The application is responsible for updating this value after each revision.
+                    </xsd:documentation>
+          </xsd:annotation>
+        </xsd:element>
+        <xsd:element name="lastModifiedBy" minOccurs="0" maxOccurs="1" type="xsd:string"/>
+        <xsd:element ref="dcterms:modified" minOccurs="0" maxOccurs="1"/>
+        <xsd:element name="contentStatus" minOccurs="0" maxOccurs="1" type="xsd:string"/>
+      </xsd:all>
+    </xsd:complexType>
+  </xsd:schema>
+  <xs:schema xmlns:pc="http://schemas.microsoft.com/office/infopath/2007/PartnerControls" xmlns:xs="http://www.w3.org/2001/XMLSchema" targetNamespace="http://schemas.microsoft.com/office/infopath/2007/PartnerControls" elementFormDefault="qualified" attributeFormDefault="unqualified">
+    <xs:element name="Person">
+      <xs:complexType>
+        <xs:sequence>
+          <xs:element ref="pc:DisplayName" minOccurs="0"/>
+          <xs:element ref="pc:AccountId" minOccurs="0"/>
+          <xs:element ref="pc:AccountType" minOccurs="0"/>
+        </xs:sequence>
+      </xs:complexType>
+    </xs:element>
+    <xs:element name="DisplayName" type="xs:string"/>
+    <xs:element name="AccountId" type="xs:string"/>
+    <xs:element name="AccountType" type="xs:string"/>
+    <xs:element name="BDCAssociatedEntity">
+      <xs:complexType>
+        <xs:sequence>
+          <xs:element ref="pc:BDCEntity" minOccurs="0" maxOccurs="unbounded"/>
+        </xs:sequence>
+        <xs:attribute ref="pc:EntityNamespace"/>
+        <xs:attribute ref="pc:EntityName"/>
+        <xs:attribute ref="pc:SystemInstanceName"/>
+        <xs:attribute ref="pc:AssociationName"/>
+      </xs:complexType>
+    </xs:element>
+    <xs:attribute name="EntityNamespace" type="xs:string"/>
+    <xs:attribute name="EntityName" type="xs:string"/>
+    <xs:attribute name="SystemInstanceName" type="xs:string"/>
+    <xs:attribute name="AssociationName" type="xs:string"/>
+    <xs:element name="BDCEntity">
+      <xs:complexType>
+        <xs:sequence>
+          <xs:element ref="pc:EntityDisplayName" minOccurs="0"/>
+          <xs:element ref="pc:EntityInstanceReference" minOccurs="0"/>
+          <xs:element ref="pc:EntityId1" minOccurs="0"/>
+          <xs:element ref="pc:EntityId2" minOccurs="0"/>
+          <xs:element ref="pc:EntityId3" minOccurs="0"/>
+          <xs:element ref="pc:EntityId4" minOccurs="0"/>
+          <xs:element ref="pc:EntityId5" minOccurs="0"/>
+        </xs:sequence>
+      </xs:complexType>
+    </xs:element>
+    <xs:element name="EntityDisplayName" type="xs:string"/>
+    <xs:element name="EntityInstanceReference" type="xs:string"/>
+    <xs:element name="EntityId1" type="xs:string"/>
+    <xs:element name="EntityId2" type="xs:string"/>
+    <xs:element name="EntityId3" type="xs:string"/>
+    <xs:element name="EntityId4" type="xs:string"/>
+    <xs:element name="EntityId5" type="xs:string"/>
+    <xs:element name="Terms">
+      <xs:complexType>
+        <xs:sequence>
+          <xs:element ref="pc:TermInfo" minOccurs="0" maxOccurs="unbounded"/>
+        </xs:sequence>
+      </xs:complexType>
+    </xs:element>
+    <xs:element name="TermInfo">
+      <xs:complexType>
+        <xs:sequence>
+          <xs:element ref="pc:TermName" minOccurs="0"/>
+          <xs:element ref="pc:TermId" minOccurs="0"/>
+        </xs:sequence>
+      </xs:complexType>
+    </xs:element>
+    <xs:element name="TermName" type="xs:string"/>
+    <xs:element name="TermId" type="xs:string"/>
+  </xs:schema>
+</ct:contentTypeSchema>
+</file>
+
+<file path=customXml/item4.xml><?xml version="1.0" encoding="utf-8"?>
+<b:Sources xmlns:b="http://schemas.openxmlformats.org/officeDocument/2006/bibliography" xmlns="http://schemas.openxmlformats.org/officeDocument/2006/bibliography" SelectedStyle="\APASixthEditionOfficeOnline.xsl" StyleName="APA" Version="6"/>
+</file>
+
+<file path=customXml/itemProps1.xml><?xml version="1.0" encoding="utf-8"?>
+<ds:datastoreItem xmlns:ds="http://schemas.openxmlformats.org/officeDocument/2006/customXml" ds:itemID="{BE71A2AA-C2C2-45EF-9CEB-115274F5DFE8}">
+  <ds:schemaRefs>
+    <ds:schemaRef ds:uri="http://schemas.microsoft.com/office/2006/metadata/properties"/>
+    <ds:schemaRef ds:uri="http://schemas.microsoft.com/office/infopath/2007/PartnerControls"/>
+    <ds:schemaRef ds:uri="http://schemas.microsoft.com/sharepoint/v3"/>
+    <ds:schemaRef ds:uri="230e9df3-be65-4c73-a93b-d1236ebd677e"/>
+    <ds:schemaRef ds:uri="71af3243-3dd4-4a8d-8c0d-dd76da1f02a5"/>
+    <ds:schemaRef ds:uri="16c05727-aa75-4e4a-9b5f-8a80a1165891"/>
+  </ds:schemaRefs>
+</ds:datastoreItem>
+</file>
+
+<file path=customXml/itemProps2.xml><?xml version="1.0" encoding="utf-8"?>
+<ds:datastoreItem xmlns:ds="http://schemas.openxmlformats.org/officeDocument/2006/customXml" ds:itemID="{F8699671-72DE-4DE8-9995-CB14096EB6BE}">
+  <ds:schemaRefs>
+    <ds:schemaRef ds:uri="http://schemas.microsoft.com/sharepoint/v3/contenttype/forms"/>
+  </ds:schemaRefs>
+</ds:datastoreItem>
+</file>
+
+<file path=customXml/itemProps3.xml><?xml version="1.0" encoding="utf-8"?>
+<ds:datastoreItem xmlns:ds="http://schemas.openxmlformats.org/officeDocument/2006/customXml" ds:itemID="{A561FEBE-91A1-4154-B6E6-5DDE7646706C}">
+  <ds:schemaRefs>
+    <ds:schemaRef ds:uri="http://schemas.microsoft.com/office/2006/metadata/contentType"/>
+    <ds:schemaRef ds:uri="http://schemas.microsoft.com/office/2006/metadata/properties/metaAttributes"/>
+    <ds:schemaRef ds:uri="http://www.w3.org/2001/XMLSchema"/>
+    <ds:schemaRef ds:uri="http://schemas.microsoft.com/office/2006/metadata/properties"/>
+    <ds:schemaRef ds:uri="http://schemas.microsoft.com/sharepoint/v3"/>
+    <ds:schemaRef ds:uri="71af3243-3dd4-4a8d-8c0d-dd76da1f02a5"/>
+    <ds:schemaRef ds:uri="16c05727-aa75-4e4a-9b5f-8a80a1165891"/>
+    <ds:schemaRef ds:uri="230e9df3-be65-4c73-a93b-d1236ebd677e"/>
+    <ds:schemaRef ds:uri="http://schemas.microsoft.com/office/2006/documentManagement/types"/>
+    <ds:schemaRef ds:uri="http://schemas.microsoft.com/office/infopath/2007/PartnerControls"/>
+    <ds:schemaRef ds:uri="http://schemas.openxmlformats.org/package/2006/metadata/core-properties"/>
+    <ds:schemaRef ds:uri="http://purl.org/dc/elements/1.1/"/>
+    <ds:schemaRef ds:uri="http://purl.org/dc/terms/"/>
+    <ds:schemaRef ds:uri="http://schemas.microsoft.com/internal/obd"/>
+  </ds:schemaRefs>
+</ds:datastoreItem>
+</file>
+
+<file path=customXml/itemProps4.xml><?xml version="1.0" encoding="utf-8"?>
+<ds:datastoreItem xmlns:ds="http://schemas.openxmlformats.org/officeDocument/2006/customXml" ds:itemID="{C6809C35-722C-423A-8C94-619EC051D659}">
+  <ds:schemaRefs>
+    <ds:schemaRef ds:uri="http://schemas.openxmlformats.org/officeDocument/2006/bibliography"/>
+  </ds:schemaRefs>
+</ds:datastoreItem>
+</file>
+
+<file path=docMetadata/LabelInfo.xml><?xml version="1.0" encoding="utf-8"?>
+<clbl:labelList xmlns:clbl="http://schemas.microsoft.com/office/2020/mipLabelMetadata">
+  <clbl:label id="{ea60d57e-af5b-4752-ac57-3e4f28ca11dc}" enabled="1" method="Privileged" siteId="{36da45f1-dd2c-4d1f-af13-5abe46b99921}" removed="0"/>
+</clbl:labelList>
 </file>
</xml_diff>